<commit_message>
Revise methodology/schema, update chapter docs, and fix tsconfig deprecation
</commit_message>
<xml_diff>
--- a/Resources/Chapters 1-3 - Final.docx
+++ b/Resources/Chapters 1-3 - Final.docx
@@ -366,7 +366,7 @@
             <w:t>Abstract</w:t>
           </w:r>
           <w:r>
-            <w:t xml:space="preserve"> above, are not considered headings so they don’t use bold heading format.  Instead, use the Section Title style.  This style automatically starts your section on a new page, so you don’t have to add page breaks.  Note that all of the styles for this template are available on the Home tab of the ribbon, in the Styles gallery.]</w:t>
+            <w:t xml:space="preserve"> above, are not considered headings so they donâ€™t use bold heading format.  Instead, use the Section Title style.  This style automatically starts your section on a new page, so you donâ€™t have to add page breaks.  Note that all of the styles for this template are available on the Home tab of the ribbon, in the Styles gallery.]</w:t>
           </w:r>
         </w:p>
       </w:sdtContent>
@@ -576,7 +576,7 @@
         <w:rPr>
           <w:rFonts w:ascii="Times New Roman" w:hAnsi="Times New Roman" w:cs="Times New Roman"/>
         </w:rPr>
-        <w:t>… with matriculation number …,</w:t>
+        <w:t>â€¦ with matriculation number â€¦,</w:t>
       </w:r>
       <w:r>
         <w:rPr>
@@ -657,7 +657,7 @@
         <w:rPr>
           <w:rFonts w:ascii="Times New Roman" w:hAnsi="Times New Roman" w:cs="Times New Roman"/>
         </w:rPr>
-        <w:t>: Dr or Prof …</w:t>
+        <w:t>: Dr or Prof â€¦</w:t>
       </w:r>
     </w:p>
     <w:p>
@@ -1315,7 +1315,15 @@
         <w:t>2.</w:t>
       </w:r>
       <w:r>
-        <w:t xml:space="preserve">1.6 Mobile-Based Learning Support and Study Behaviour Regulation </w:t>
+        <w:t xml:space="preserve">1.6 Mobile-Based Learning Support and Study </w:t>
+      </w:r>
+      <w:proofErr w:type="spellStart"/>
+      <w:r>
+        <w:t>Behaviour</w:t>
+      </w:r>
+      <w:proofErr w:type="spellEnd"/>
+      <w:r>
+        <w:t xml:space="preserve"> Regulation </w:t>
       </w:r>
       <w:r>
         <w:tab/>
@@ -1473,7 +1481,15 @@
         <w:t xml:space="preserve"> </w:t>
       </w:r>
       <w:r>
-        <w:t xml:space="preserve">OU Analyse (Open University Learning Analytics System) </w:t>
+        <w:t xml:space="preserve">OU </w:t>
+      </w:r>
+      <w:proofErr w:type="spellStart"/>
+      <w:r>
+        <w:t>Analyse</w:t>
+      </w:r>
+      <w:proofErr w:type="spellEnd"/>
+      <w:r>
+        <w:t xml:space="preserve"> (Open University Learning Analytics System) </w:t>
       </w:r>
       <w:r>
         <w:tab/>
@@ -1526,8 +1542,13 @@
       <w:r>
         <w:t xml:space="preserve"> </w:t>
       </w:r>
-      <w:r>
-        <w:t xml:space="preserve">Knewton Adaptive Learning Platform </w:t>
+      <w:proofErr w:type="spellStart"/>
+      <w:r>
+        <w:t>Knewton</w:t>
+      </w:r>
+      <w:proofErr w:type="spellEnd"/>
+      <w:r>
+        <w:t xml:space="preserve"> Adaptive Learning Platform </w:t>
       </w:r>
       <w:r>
         <w:tab/>
@@ -2530,7 +2551,15 @@
         <w:ind w:firstLine="0"/>
       </w:pPr>
       <w:r>
-        <w:t xml:space="preserve">Figure 3.1: MyStudyLife Snapshot   </w:t>
+        <w:t xml:space="preserve">Figure 3.1: </w:t>
+      </w:r>
+      <w:proofErr w:type="spellStart"/>
+      <w:r>
+        <w:t>MyStudyLife</w:t>
+      </w:r>
+      <w:proofErr w:type="spellEnd"/>
+      <w:r>
+        <w:t xml:space="preserve"> Snapshot   </w:t>
       </w:r>
       <w:r>
         <w:tab/>
@@ -2799,7 +2828,31 @@
       </w:r>
       <w:r>
         <w:lastRenderedPageBreak/>
-        <w:t>intelligence for the analysis of study behaviours, feedback provision and personalized learning support in higher education is rapidly increasing (Viberg et al., 2018; Ifenthaler &amp; Yau, 2020). These data-driven advancements crucially inform learners on potential techniques to improve their study planning and learning efficiency based on the system's insight of student or learner data. However there is a fragmentation of existing systems due to their focus on learner performance monitoring rather than continuous support for personalized study organisation (Viberg et al., 2018).</w:t>
+        <w:t xml:space="preserve">intelligence for the analysis of study </w:t>
+      </w:r>
+      <w:proofErr w:type="spellStart"/>
+      <w:r>
+        <w:t>behaviours</w:t>
+      </w:r>
+      <w:proofErr w:type="spellEnd"/>
+      <w:r>
+        <w:t xml:space="preserve">, feedback provision and personalized learning support in higher education is rapidly increasing (Viberg et al., 2018; </w:t>
+      </w:r>
+      <w:proofErr w:type="spellStart"/>
+      <w:r>
+        <w:t>Ifenthaler</w:t>
+      </w:r>
+      <w:proofErr w:type="spellEnd"/>
+      <w:r>
+        <w:t xml:space="preserve"> &amp; Yau, 2020). These data-driven advancements crucially inform learners on potential techniques to improve their study planning and learning efficiency based on the system's insight of student or learner data. However there is a fragmentation of existing systems due to their focus on learner performance monitoring rather than continuous support for personalized study </w:t>
+      </w:r>
+      <w:proofErr w:type="spellStart"/>
+      <w:r>
+        <w:t>organisation</w:t>
+      </w:r>
+      <w:proofErr w:type="spellEnd"/>
+      <w:r>
+        <w:t xml:space="preserve"> (Viberg et al., 2018).</w:t>
       </w:r>
     </w:p>
     <w:p/>
@@ -2811,7 +2864,15 @@
     <w:p/>
     <w:p>
       <w:r>
-        <w:t>The opportunity of mobile-based systems as the primary platform for planning study support is derived from the widespread use of smartphones by the general population of higher education students. The use of smartphones has become a daily habit for students hence utilizing integrated mobile platforms for delivering reminders, notifications and personalized learning support is a suitable idea (Oulasvirta et al., 2012). Still, there is very limited exploration into the use of mobile platforms to regulate personalized study time management and optimisation.</w:t>
+        <w:t>The opportunity of mobile-based systems as the primary platform for planning study support is derived from the widespread use of smartphones by the general population of higher education students. The use of smartphones has become a daily habit for students hence utilizing integrated mobile platforms for delivering reminders, notifications and personalized learning support is a suitable idea (</w:t>
+      </w:r>
+      <w:proofErr w:type="spellStart"/>
+      <w:r>
+        <w:t>Oulasvirta</w:t>
+      </w:r>
+      <w:proofErr w:type="spellEnd"/>
+      <w:r>
+        <w:t xml:space="preserve"> et al., 2012). Still, there is very limited exploration into the use of mobile platforms to regulate personalized study time management and optimisation.</w:t>
       </w:r>
     </w:p>
     <w:p/>
@@ -2849,26 +2910,58 @@
         <w:t>Regardless of the necessity of competent study planning and time management for students in higher education, it remains a difficulty for them.</w:t>
       </w:r>
       <w:r>
-        <w:t xml:space="preserve"> Many learners often struggle to marshal their learning routines and allocate time efficiently across courses or subjects which inevitably leads to poor academic performances and increased stress (Broadbent, 2017). Only on rare occasions do tactics for study planning take into account the adaptation to individual learning behaviours or patterns. These tactics may include manual timetables and self-structured scheduling.</w:t>
+        <w:t xml:space="preserve"> Many learners often struggle to marshal their learning routines and allocate time efficiently across courses or subjects which inevitably leads to poor academic performances and increased stress (Broadbent, 2017). Only on rare occasions do tactics for study planning take into account the adaptation to individual learning </w:t>
+      </w:r>
+      <w:proofErr w:type="spellStart"/>
+      <w:r>
+        <w:t>behaviours</w:t>
+      </w:r>
+      <w:proofErr w:type="spellEnd"/>
+      <w:r>
+        <w:t xml:space="preserve"> or patterns. These tactics may include manual timetables and self-structured scheduling.</w:t>
       </w:r>
     </w:p>
     <w:p/>
     <w:p>
       <w:r>
         <w:lastRenderedPageBreak/>
-        <w:t>Even though recent digital technology advancements aid learning and content delivery through artificial intelligence-supported systems that use learning analytics, there is still a gap that is not focused on, which is the lack of coverage on personalized learning feedback and time management support (Viberg et al., 2018; Ifenthaler &amp; Yau, 2020). Many of these current systems do not function in conjunction with individual learners' study routines, which in turn limits their effectiveness in aiding organized study habits.</w:t>
+        <w:t xml:space="preserve">Even though recent digital technology advancements aid learning and content delivery through artificial intelligence-supported systems that use learning analytics, there is still a gap that is not focused on, which is the lack of coverage on personalized learning feedback and time management support (Viberg et al., 2018; </w:t>
+      </w:r>
+      <w:proofErr w:type="spellStart"/>
+      <w:r>
+        <w:t>Ifenthaler</w:t>
+      </w:r>
+      <w:proofErr w:type="spellEnd"/>
+      <w:r>
+        <w:t xml:space="preserve"> &amp; Yau, 2020). Many of these current systems do not function in conjunction with individual learners' study routines, which in turn limits their effectiveness in aiding organized study habits.</w:t>
       </w:r>
     </w:p>
     <w:p/>
     <w:p>
       <w:r>
-        <w:t>Artificial intelligence-supported learning systems, like intelligent tutoring systems, positively influence learner or student engagement and achievement (Kulik &amp; Fletcher, 2016; Kim et al., 2020). However amidst this, these systems fail to tackle the challenge of providing personalized time management support and promoting progressive learner behaviours. This results in learners being left with inadequate learning tools in higher education.</w:t>
+        <w:t xml:space="preserve">Artificial intelligence-supported learning systems, like intelligent tutoring systems, positively influence learner or student engagement and achievement (Kulik &amp; Fletcher, 2016; Kim et al., 2020). However amidst this, these systems fail to tackle the challenge of providing personalized time management support and promoting progressive learner </w:t>
+      </w:r>
+      <w:proofErr w:type="spellStart"/>
+      <w:r>
+        <w:t>behaviours</w:t>
+      </w:r>
+      <w:proofErr w:type="spellEnd"/>
+      <w:r>
+        <w:t>. This results in learners being left with inadequate learning tools in higher education.</w:t>
       </w:r>
     </w:p>
     <w:p/>
     <w:p>
       <w:r>
-        <w:t>The use of smartphones among students in higher education, provides an opportunity to deliver an intelligent learning support tool on mobile platforms. Studies signify that regular smartphone use can fortify daily habits through mobile notifications or reminders (Oulasvirta et al., 2012). This potential has not been fully harnessed to enhance learning habits in students.</w:t>
+        <w:t>The use of smartphones among students in higher education, provides an opportunity to deliver an intelligent learning support tool on mobile platforms. Studies signify that regular smartphone use can fortify daily habits through mobile notifications or reminders (</w:t>
+      </w:r>
+      <w:proofErr w:type="spellStart"/>
+      <w:r>
+        <w:t>Oulasvirta</w:t>
+      </w:r>
+      <w:proofErr w:type="spellEnd"/>
+      <w:r>
+        <w:t xml:space="preserve"> et al., 2012). This potential has not been fully harnessed to enhance learning habits in students.</w:t>
       </w:r>
     </w:p>
     <w:p>
@@ -2950,8 +3043,13 @@
         <w:t>Propose an intelligent study planning system that integrates academic performance data, learning preferences and available study time to generate</w:t>
       </w:r>
       <w:r>
-        <w:t xml:space="preserve"> or optimise</w:t>
-      </w:r>
+        <w:t xml:space="preserve"> or </w:t>
+      </w:r>
+      <w:proofErr w:type="spellStart"/>
+      <w:r>
+        <w:t>optimise</w:t>
+      </w:r>
+      <w:proofErr w:type="spellEnd"/>
       <w:r>
         <w:t xml:space="preserve"> personalized study timetables.</w:t>
       </w:r>
@@ -2996,10 +3094,18 @@
         </w:numPr>
       </w:pPr>
       <w:r>
-        <w:t>Evaluate the developed system</w:t>
-      </w:r>
-      <w:r>
-        <w:t>’s</w:t>
+        <w:t xml:space="preserve">Evaluate the developed </w:t>
+      </w:r>
+      <w:proofErr w:type="spellStart"/>
+      <w:r>
+        <w:t>system</w:t>
+      </w:r>
+      <w:r>
+        <w:t>â</w:t>
+      </w:r>
+      <w:proofErr w:type="spellEnd"/>
+      <w:r>
+        <w:t>€™s</w:t>
       </w:r>
       <w:r>
         <w:t xml:space="preserve"> </w:t>
@@ -3025,7 +3131,23 @@
       </w:r>
       <w:r>
         <w:lastRenderedPageBreak/>
-        <w:t>preferences and available time are analysed to generate and optimise personalised study plans. The system design and technological choices are detailed in Chapter Three which provides a foundation for subsequent system implementation and evaluation.</w:t>
+        <w:t xml:space="preserve">preferences and available time are </w:t>
+      </w:r>
+      <w:proofErr w:type="spellStart"/>
+      <w:r>
+        <w:t>analysed</w:t>
+      </w:r>
+      <w:proofErr w:type="spellEnd"/>
+      <w:r>
+        <w:t xml:space="preserve"> to generate and </w:t>
+      </w:r>
+      <w:proofErr w:type="spellStart"/>
+      <w:r>
+        <w:t>optimise</w:t>
+      </w:r>
+      <w:proofErr w:type="spellEnd"/>
+      <w:r>
+        <w:t xml:space="preserve"> personalised study plans. The system design and technological choices are detailed in Chapter Three which provides a foundation for subsequent system implementation and evaluation.</w:t>
       </w:r>
     </w:p>
     <w:p>
@@ -3054,7 +3176,15 @@
     </w:p>
     <w:p>
       <w:r>
-        <w:t>The scope of this project is limited to the development of a software-based system that generates or optimises personalised study timetables and learning strategy recommendations. The system's main job is to look at academic performance data, figure out how students learn best, suggest learning recommendations and send reminders to study through a mobile or web interface. It doesn't try to replace conventional teaching methods or guess how examinations will turn out.</w:t>
+        <w:t xml:space="preserve">The scope of this project is limited to the development of a software-based system that generates or </w:t>
+      </w:r>
+      <w:proofErr w:type="spellStart"/>
+      <w:r>
+        <w:t>optimises</w:t>
+      </w:r>
+      <w:proofErr w:type="spellEnd"/>
+      <w:r>
+        <w:t xml:space="preserve"> personalised study timetables and learning strategy recommendations. The system's main job is to look at academic performance data, figure out how students learn best, suggest learning recommendations and send reminders to study through a mobile or web interface. It doesn't try to replace conventional teaching methods or guess how examinations will turn out.</w:t>
       </w:r>
     </w:p>
     <w:p>
@@ -3070,14 +3200,17 @@
     </w:p>
     <w:p>
       <w:r>
-        <w:t xml:space="preserve">The effectiveness of the system depends on the accuracy of user-provided data such as academic performance and responses to learning style questionnaires. </w:t>
-      </w:r>
-      <w:r>
-        <w:t xml:space="preserve">The size and quality of the dataset used to train the models make it hard to recommend a learning style or improve the </w:t>
+        <w:t>A key limitation of this study is the domain gap between external training datasets and the target undergraduate context. Although external datasets provide sufficient volume and reliability for initial model development, proxy</w:t>
+      </w:r>
+      <w:r>
+        <w:t xml:space="preserve"> </w:t>
+      </w:r>
+      <w:r>
+        <w:t xml:space="preserve">based feature mapping may not fully capture </w:t>
       </w:r>
       <w:r>
         <w:lastRenderedPageBreak/>
-        <w:t>schedule. These things could change how well the system works for making suggestions to different groups of students.</w:t>
+        <w:t>local study habits, curriculum structures, and institutional factors. As a result, recommendation and optimisation performance may vary across student groups until sufficient in-app behavioural logs are accumulated for domain adaptation and retraining.</w:t>
       </w:r>
     </w:p>
     <w:p>
@@ -3170,13 +3303,21 @@
         <w:t xml:space="preserve"> </w:t>
       </w:r>
       <w:r>
-        <w:t>The process of gathering and analy</w:t>
+        <w:t xml:space="preserve">The process of gathering and </w:t>
+      </w:r>
+      <w:proofErr w:type="spellStart"/>
+      <w:r>
+        <w:t>analy</w:t>
       </w:r>
       <w:r>
         <w:t>s</w:t>
       </w:r>
       <w:r>
-        <w:t>ing data on learners in order to make reports that help people understand and improve how they learn.</w:t>
+        <w:t>ing</w:t>
+      </w:r>
+      <w:proofErr w:type="spellEnd"/>
+      <w:r>
+        <w:t xml:space="preserve"> data on learners in order to make reports that help people understand and improve how they learn.</w:t>
       </w:r>
     </w:p>
     <w:p/>
@@ -3257,13 +3398,21 @@
     </w:p>
     <w:p>
       <w:r>
-        <w:t>Self-regulated learning (SRL) is the capacity of the learner to plan, monitor and evaluate his or her learning activity. It also involves learners assessing the cognitive, motivational and behavioural activities. SRL encompasses a broad field that influences the process of learning and includes cognitive processes, metacognitive mindfulness, motivation and regulating emotions hence, it is an inclusive model to examine how students become engaged in academic pursuits (Panadero, 2017). Self-regulated learners are self</w:t>
+        <w:t xml:space="preserve">Self-regulated learning (SRL) is the capacity of the learner to plan, monitor and evaluate his or her learning activity. It also involves learners assessing the cognitive, motivational and behavioural activities. SRL encompasses a broad field that influences the process of learning and includes cognitive processes, metacognitive mindfulness, motivation and regulating emotions hence, it is an inclusive model to examine how students become engaged in academic pursuits (Panadero, 2017). Self-regulated learners are </w:t>
+      </w:r>
+      <w:proofErr w:type="spellStart"/>
+      <w:r>
+        <w:t>self</w:t>
       </w:r>
       <w:r>
         <w:t xml:space="preserve"> </w:t>
       </w:r>
       <w:r>
-        <w:t>directed students who assume the role</w:t>
+        <w:t>directed</w:t>
+      </w:r>
+      <w:proofErr w:type="spellEnd"/>
+      <w:r>
+        <w:t xml:space="preserve"> students who assume the role</w:t>
       </w:r>
       <w:r>
         <w:t>s involved in</w:t>
@@ -3275,7 +3424,15 @@
     <w:p/>
     <w:p>
       <w:r>
-        <w:t>The rise of SRL in higher education is as a result of greater independence which students get. According to Zimmerman and Schunk (2011), self-regulated learners are ambitious people, who consciously activate and maintain thoughts, emotions and behaviours that are goal focused in meeting learning objectives. Such learners know their strengths and weaknesses and they are also directed by the goals that they set themselves and task</w:t>
+        <w:t xml:space="preserve">The rise of SRL in higher education is as a result of greater independence which students get. According to Zimmerman and Schunk (2011), self-regulated learners are ambitious people, who consciously activate and maintain thoughts, emotions and </w:t>
+      </w:r>
+      <w:proofErr w:type="spellStart"/>
+      <w:r>
+        <w:t>behaviours</w:t>
+      </w:r>
+      <w:proofErr w:type="spellEnd"/>
+      <w:r>
+        <w:t xml:space="preserve"> that are goal focused in meeting learning objectives. Such learners know their strengths and weaknesses and they are also directed by the goals that they set themselves and task</w:t>
       </w:r>
       <w:r>
         <w:t xml:space="preserve"> </w:t>
@@ -3291,13 +3448,29 @@
     <w:p/>
     <w:p>
       <w:r>
-        <w:t xml:space="preserve">There is empirical evidence that indicates the close association that exists between self-regulated learning and academic performance in institutions of higher education. According to Ifenthaler and Yau (2020), SRL is a key to the success of study since it directly affects the capacity of students to cope with learning activities, especially in online and independent learning platforms. They also note that too many university students had impaired self-regulation skills that could result in poor performance in school. This is </w:t>
+        <w:t xml:space="preserve">There is empirical evidence that indicates the close association that exists between self-regulated learning and academic performance in institutions of higher education. According to </w:t>
+      </w:r>
+      <w:proofErr w:type="spellStart"/>
+      <w:r>
+        <w:t>Ifenthaler</w:t>
+      </w:r>
+      <w:proofErr w:type="spellEnd"/>
+      <w:r>
+        <w:t xml:space="preserve"> and Yau (2020), SRL is a key to the success of study since it directly affects the capacity of students to cope with learning activities, especially in online and independent learning platforms. They also note that too many university students had impaired self-regulation skills that could result in poor performance in school. This is </w:t>
       </w:r>
       <w:r>
         <w:t>heightened</w:t>
       </w:r>
       <w:r>
-        <w:t xml:space="preserve"> by the high use of digital learning whereby effective learning is reliant on the capability of the students to control their study behaviour independently.</w:t>
+        <w:t xml:space="preserve"> by the high use of digital learning whereby effective learning is reliant on the capability of the students to control their study </w:t>
+      </w:r>
+      <w:proofErr w:type="spellStart"/>
+      <w:r>
+        <w:t>behaviour</w:t>
+      </w:r>
+      <w:proofErr w:type="spellEnd"/>
+      <w:r>
+        <w:t xml:space="preserve"> independently.</w:t>
       </w:r>
     </w:p>
     <w:p>
@@ -3316,13 +3489,29 @@
         <w:t xml:space="preserve">of the </w:t>
       </w:r>
       <w:r>
-        <w:t>most important aspects of self-regulated learning particularly in higher learning institutions are study planning and time management where students are supposed to be in an autonomy of arranging their own learning processes. Planning is concerned with determination of learning objectives and allocating time and resources to academic endeavours and time management is the responsibility of scheduling and controlling the study time towards achievement of the objectives (Jansen et al., 2019).</w:t>
+        <w:t xml:space="preserve">most important aspects of self-regulated learning particularly in higher learning institutions are study planning and time management where students are supposed to be in an autonomy of arranging their own learning processes. Planning is concerned with determination of learning objectives and allocating time and resources to academic </w:t>
+      </w:r>
+      <w:proofErr w:type="spellStart"/>
+      <w:r>
+        <w:t>endeavours</w:t>
+      </w:r>
+      <w:proofErr w:type="spellEnd"/>
+      <w:r>
+        <w:t xml:space="preserve"> and time management is the responsibility of scheduling and controlling the study time towards achievement of the objectives (Jansen et al., 2019).</w:t>
       </w:r>
     </w:p>
     <w:p/>
     <w:p>
       <w:r>
-        <w:t xml:space="preserve">The existing empirical findings indicate that planning and time management skills are good predictors of academic success and advancement in the university environment. As Ifenthaler and Yau (2020) point out, the capacity of students to organize their learning activities </w:t>
+        <w:t xml:space="preserve">The existing empirical findings indicate that planning and time management skills are good predictors of academic success and advancement in the university environment. As </w:t>
+      </w:r>
+      <w:proofErr w:type="spellStart"/>
+      <w:r>
+        <w:t>Ifenthaler</w:t>
+      </w:r>
+      <w:proofErr w:type="spellEnd"/>
+      <w:r>
+        <w:t xml:space="preserve"> and Yau (2020) point out, the capacity of students to organize their learning activities </w:t>
       </w:r>
       <w:r>
         <w:lastRenderedPageBreak/>
@@ -3374,7 +3563,15 @@
         <w:t>ed by</w:t>
       </w:r>
       <w:r>
-        <w:t xml:space="preserve"> learners are compounded by the growing flexibility of online learning whereby poor planning can easily result in procrastination and study behaviour ineffectiveness.</w:t>
+        <w:t xml:space="preserve"> learners are compounded by the growing flexibility of online learning whereby poor planning can easily result in procrastination and study </w:t>
+      </w:r>
+      <w:proofErr w:type="spellStart"/>
+      <w:r>
+        <w:t>behaviour</w:t>
+      </w:r>
+      <w:proofErr w:type="spellEnd"/>
+      <w:r>
+        <w:t xml:space="preserve"> ineffectiveness.</w:t>
       </w:r>
     </w:p>
     <w:p/>
@@ -3422,7 +3619,23 @@
         <w:t xml:space="preserve"> </w:t>
       </w:r>
       <w:r>
-        <w:t xml:space="preserve">task behaviours in students that can be used as indicators of planning efficiency and engagement in studying (Ifenthaler </w:t>
+        <w:t xml:space="preserve">task </w:t>
+      </w:r>
+      <w:proofErr w:type="spellStart"/>
+      <w:r>
+        <w:t>behaviours</w:t>
+      </w:r>
+      <w:proofErr w:type="spellEnd"/>
+      <w:r>
+        <w:t xml:space="preserve"> in students that can be used as indicators of planning efficiency and engagement in studying (</w:t>
+      </w:r>
+      <w:proofErr w:type="spellStart"/>
+      <w:r>
+        <w:t>Ifenthaler</w:t>
+      </w:r>
+      <w:proofErr w:type="spellEnd"/>
+      <w:r>
+        <w:t xml:space="preserve"> </w:t>
       </w:r>
       <w:r>
         <w:t>&amp;</w:t>
@@ -3445,31 +3658,79 @@
       </w:r>
       <w:r>
         <w:lastRenderedPageBreak/>
-        <w:t>analytics is a measure that builds on data concerning students and their frameworks to create significant feedback, improve learning results and aid judgment among educational actors. On the same note Viberg et al. (2018) describes learning analytics as the process of measuring and analyzing learner information to optimise learning and learning environments in which learning takes place as an indicator of its popularity in higher education.</w:t>
+        <w:t xml:space="preserve">analytics is a measure that builds on data concerning students and their frameworks to create significant feedback, improve learning results and aid judgment among educational actors. On the same note Viberg et al. (2018) describes learning analytics as the process of measuring and analyzing learner information to </w:t>
+      </w:r>
+      <w:proofErr w:type="spellStart"/>
+      <w:r>
+        <w:t>optimise</w:t>
+      </w:r>
+      <w:proofErr w:type="spellEnd"/>
+      <w:r>
+        <w:t xml:space="preserve"> learning and learning environments in which learning takes place as an indicator of its popularity in higher education.</w:t>
       </w:r>
     </w:p>
     <w:p/>
     <w:p>
       <w:r>
-        <w:t xml:space="preserve">It is a well-known fact that this systematic process is a multidisciplinary area that utilizes artificial intelligence, machine learning, statistics, and social sciences to analyse educational data (Drachsler </w:t>
+        <w:t xml:space="preserve">It is a well-known fact that this systematic process is a multidisciplinary area that utilizes artificial intelligence, machine learning, statistics, and social sciences to </w:t>
+      </w:r>
+      <w:proofErr w:type="spellStart"/>
+      <w:r>
+        <w:t>analyse</w:t>
+      </w:r>
+      <w:proofErr w:type="spellEnd"/>
+      <w:r>
+        <w:t xml:space="preserve"> educational data (</w:t>
+      </w:r>
+      <w:proofErr w:type="spellStart"/>
+      <w:r>
+        <w:t>Drachsler</w:t>
+      </w:r>
+      <w:proofErr w:type="spellEnd"/>
+      <w:r>
+        <w:t xml:space="preserve"> </w:t>
       </w:r>
       <w:r>
         <w:t>&amp;</w:t>
       </w:r>
       <w:r>
-        <w:t xml:space="preserve"> Greller, 2016). This socio-technical quality of learning analytics enables their systems to go beyond mere reporting of data to more sophisticated modelling, prediction and optimisation of the learning processes (Ifenthaler </w:t>
+        <w:t xml:space="preserve"> Greller, 2016). This socio-technical quality of learning analytics enables their systems to go beyond mere reporting of data to more sophisticated modelling, prediction and optimisation of the learning processes (</w:t>
+      </w:r>
+      <w:proofErr w:type="spellStart"/>
+      <w:r>
+        <w:t>Ifenthaler</w:t>
+      </w:r>
+      <w:proofErr w:type="spellEnd"/>
+      <w:r>
+        <w:t xml:space="preserve"> </w:t>
       </w:r>
       <w:r>
         <w:t>&amp;</w:t>
       </w:r>
       <w:r>
-        <w:t xml:space="preserve"> Yau, 2020). These types of system are becoming more prevalent in higher education establishment in an attempt to learn more about the student behaviour, level of engagement, and academic development.</w:t>
+        <w:t xml:space="preserve"> Yau, 2020). These types of system are becoming more prevalent in higher education establishment in an attempt to learn more about the student </w:t>
+      </w:r>
+      <w:proofErr w:type="spellStart"/>
+      <w:r>
+        <w:t>behaviour</w:t>
+      </w:r>
+      <w:proofErr w:type="spellEnd"/>
+      <w:r>
+        <w:t>, level of engagement, and academic development.</w:t>
       </w:r>
     </w:p>
     <w:p/>
     <w:p>
       <w:r>
-        <w:t>Much learning analytics research has been conducted on academic performance prediction and risk prediction of poor academic performance in students. The article by Ifenthaler and Yau (2020) informs about the evidence that numerous learning analytics applications seek to facilitate the success of study by early alert and specific feedback according to the interactions between the students and their learning environments. The learning analytics systems have these predictive and diagnostic properties that allow educators and institutions to intervene in the learning process of students proactively and not reactively.</w:t>
+        <w:t xml:space="preserve">Much learning analytics research has been conducted on academic performance prediction and risk prediction of poor academic performance in students. The article by </w:t>
+      </w:r>
+      <w:proofErr w:type="spellStart"/>
+      <w:r>
+        <w:t>Ifenthaler</w:t>
+      </w:r>
+      <w:proofErr w:type="spellEnd"/>
+      <w:r>
+        <w:t xml:space="preserve"> and Yau (2020) informs about the evidence that numerous learning analytics applications seek to facilitate the success of study by early alert and specific feedback according to the interactions between the students and their learning environments. The learning analytics systems have these predictive and diagnostic properties that allow educators and institutions to intervene in the learning process of students proactively and not reactively.</w:t>
       </w:r>
     </w:p>
     <w:p/>
@@ -3488,7 +3749,15 @@
     <w:p/>
     <w:p>
       <w:r>
-        <w:t>Recent studies also demonstrate the significance of feedback that is customized on a personal and context-specific level in learning analytics systems. Lim et al. (2021) maintain that learning analytics is applicable to create learning metrics and benchmarks that can be presented to students with the help of dashboards or personalised messages. They also warn that generic analytics models are not always able to meet the needs of individual learning, which point to the need to improve the methods. Learning analytics systems may process a substantial amount of learner data in combination with AI and deliver timely feedback and insights on learning patterns boosting their potential to support effective study behaviours (Tang, 2024).</w:t>
+        <w:t xml:space="preserve">Recent studies also demonstrate the significance of feedback that is customized on a personal and context-specific level in learning analytics systems. Lim et al. (2021) maintain that learning analytics is applicable to create learning metrics and benchmarks that can be presented to students with the help of dashboards or personalised messages. They also warn that generic analytics models are not always able to meet the needs of individual learning, which point to the need to improve the methods. Learning analytics systems may process a substantial amount of learner data in combination with AI and deliver timely feedback and insights on learning patterns boosting their potential to support effective study </w:t>
+      </w:r>
+      <w:proofErr w:type="spellStart"/>
+      <w:r>
+        <w:t>behaviours</w:t>
+      </w:r>
+      <w:proofErr w:type="spellEnd"/>
+      <w:r>
+        <w:t xml:space="preserve"> (Tang, 2024).</w:t>
       </w:r>
     </w:p>
     <w:p>
@@ -3513,7 +3782,15 @@
         <w:t xml:space="preserve"> </w:t>
       </w:r>
       <w:r>
-        <w:t xml:space="preserve">like capabilities thus allowing them to analyse educational data and carry out complex functions such as profiling learners, predicting academic performance and identifying </w:t>
+        <w:t xml:space="preserve">like capabilities thus allowing them to </w:t>
+      </w:r>
+      <w:proofErr w:type="spellStart"/>
+      <w:r>
+        <w:t>analyse</w:t>
+      </w:r>
+      <w:proofErr w:type="spellEnd"/>
+      <w:r>
+        <w:t xml:space="preserve"> educational data and carry out complex functions such as profiling learners, predicting academic performance and identifying </w:t>
       </w:r>
       <w:r>
         <w:lastRenderedPageBreak/>
@@ -3523,19 +3800,51 @@
     <w:p/>
     <w:p>
       <w:r>
-        <w:t>Artificial Intelligence in Education (AIEd) is an inherently interdisciplinary field that incorporates aspects of artificial intelligence with other fields like education, psychology and philosophy to improve the comprehension and to create learning in various contexts (Luckin et al., 2016). The initial uses of AI in education such as Intelligent Tutoring Systems (ITS), were based on a set of rules and quite limited error detection. The current advances in machine learning, neural networks and data-driven algorithms have provided a means to more adaptable and autonomous systems that can customise learning material based on the vast amount of learner data (Luckin et al., 2016).</w:t>
+        <w:t>Artificial Intelligence in Education (</w:t>
+      </w:r>
+      <w:proofErr w:type="spellStart"/>
+      <w:r>
+        <w:t>AIEd</w:t>
+      </w:r>
+      <w:proofErr w:type="spellEnd"/>
+      <w:r>
+        <w:t xml:space="preserve">) is an inherently interdisciplinary field that incorporates aspects of artificial intelligence with other fields like education, psychology and philosophy to improve the comprehension and to create learning in various contexts (Luckin et al., 2016). The initial uses of AI in education such as Intelligent Tutoring Systems (ITS), were based on a set of rules and quite limited error detection. The current advances in machine learning, neural networks and data-driven algorithms have provided a means to more adaptable and autonomous systems that can </w:t>
+      </w:r>
+      <w:proofErr w:type="spellStart"/>
+      <w:r>
+        <w:t>customise</w:t>
+      </w:r>
+      <w:proofErr w:type="spellEnd"/>
+      <w:r>
+        <w:t xml:space="preserve"> learning material based on the vast amount of learner data (Luckin et al., 2016).</w:t>
       </w:r>
     </w:p>
     <w:p/>
     <w:p>
       <w:r>
-        <w:t>The existing uses of AI in learning are inclined to pay more attention to personalisation and adaptive support. According to Tang (2024), AI</w:t>
+        <w:t xml:space="preserve">The existing uses of AI in learning are inclined to pay more attention to </w:t>
+      </w:r>
+      <w:proofErr w:type="spellStart"/>
+      <w:r>
+        <w:t>personalisation</w:t>
+      </w:r>
+      <w:proofErr w:type="spellEnd"/>
+      <w:r>
+        <w:t xml:space="preserve"> and adaptive support. According to Tang (2024), AI</w:t>
       </w:r>
       <w:r>
         <w:t xml:space="preserve"> </w:t>
       </w:r>
       <w:r>
-        <w:t>based learning services compute data of students such as learning style, learning habits and activity rates to provide customised content, feedback and suggestions. Intelligent tutoring systems even go as far as to offer personalised instructions and feedback that replicates the functions of human tutors and assist the learners through the learning process.</w:t>
+        <w:t xml:space="preserve">based learning services compute data of students such as learning style, learning habits and activity rates to provide </w:t>
+      </w:r>
+      <w:proofErr w:type="spellStart"/>
+      <w:r>
+        <w:t>customised</w:t>
+      </w:r>
+      <w:proofErr w:type="spellEnd"/>
+      <w:r>
+        <w:t xml:space="preserve"> content, feedback and suggestions. Intelligent tutoring systems even go as far as to offer personalised instructions and feedback that replicates the functions of human tutors and assist the learners through the learning process.</w:t>
       </w:r>
     </w:p>
     <w:p/>
@@ -3551,7 +3860,15 @@
       </w:r>
       <w:r>
         <w:lastRenderedPageBreak/>
-        <w:t>monitoring, and reflection. The interventions are especially useful in the context of digital learning when the learner has to assume complete control over the study behaviour.</w:t>
+        <w:t xml:space="preserve">monitoring, and reflection. The interventions are especially useful in the context of digital learning when the learner has to assume complete control over the study </w:t>
+      </w:r>
+      <w:proofErr w:type="spellStart"/>
+      <w:r>
+        <w:t>behaviour</w:t>
+      </w:r>
+      <w:proofErr w:type="spellEnd"/>
+      <w:r>
+        <w:t>.</w:t>
       </w:r>
     </w:p>
     <w:p/>
@@ -3560,7 +3877,23 @@
         <w:t>There has finally been</w:t>
       </w:r>
       <w:r>
-        <w:t xml:space="preserve"> a shift from teacher-centred to learner-centred education by enabling personalised, adaptive and data-informed learning experiences </w:t>
+        <w:t xml:space="preserve"> a shift from teacher-</w:t>
+      </w:r>
+      <w:proofErr w:type="spellStart"/>
+      <w:r>
+        <w:t>centred</w:t>
+      </w:r>
+      <w:proofErr w:type="spellEnd"/>
+      <w:r>
+        <w:t xml:space="preserve"> to learner-</w:t>
+      </w:r>
+      <w:proofErr w:type="spellStart"/>
+      <w:r>
+        <w:t>centred</w:t>
+      </w:r>
+      <w:proofErr w:type="spellEnd"/>
+      <w:r>
+        <w:t xml:space="preserve"> education by enabling personalised, adaptive and data-informed learning experiences </w:t>
       </w:r>
       <w:r>
         <w:t xml:space="preserve">which AI contributes to </w:t>
@@ -3633,13 +3966,45 @@
         <w:t>aspects</w:t>
       </w:r>
       <w:r>
-        <w:t xml:space="preserve"> through which these processes can be observed, analysed and supported within digital learning environments.</w:t>
+        <w:t xml:space="preserve"> through which these processes can be observed, </w:t>
+      </w:r>
+      <w:proofErr w:type="spellStart"/>
+      <w:r>
+        <w:t>analysed</w:t>
+      </w:r>
+      <w:proofErr w:type="spellEnd"/>
+      <w:r>
+        <w:t xml:space="preserve"> and supported within digital learning environments.</w:t>
       </w:r>
     </w:p>
     <w:p/>
     <w:p>
       <w:r>
-        <w:t xml:space="preserve">Learning analytics functions as a foundational layer by capturing and analysing data related to learners’ interactions, behaviours and progress. By </w:t>
+        <w:t xml:space="preserve">Learning analytics functions as a foundational layer by capturing and </w:t>
+      </w:r>
+      <w:proofErr w:type="spellStart"/>
+      <w:r>
+        <w:t>analysing</w:t>
+      </w:r>
+      <w:proofErr w:type="spellEnd"/>
+      <w:r>
+        <w:t xml:space="preserve"> data related to </w:t>
+      </w:r>
+      <w:proofErr w:type="spellStart"/>
+      <w:r>
+        <w:t>learnersâ</w:t>
+      </w:r>
+      <w:proofErr w:type="spellEnd"/>
+      <w:r>
+        <w:t xml:space="preserve">€™ interactions, </w:t>
+      </w:r>
+      <w:proofErr w:type="spellStart"/>
+      <w:r>
+        <w:t>behaviours</w:t>
+      </w:r>
+      <w:proofErr w:type="spellEnd"/>
+      <w:r>
+        <w:t xml:space="preserve"> and progress. By </w:t>
       </w:r>
       <w:r>
         <w:t>giving</w:t>
@@ -3663,7 +4028,15 @@
         <w:t xml:space="preserve"> </w:t>
       </w:r>
       <w:r>
-        <w:t xml:space="preserve">which are key components of the SRL cycle (Zimmerman &amp; Schunk, 2011; Ifenthaler &amp; Yau, 2020). Through personalised and timely feedback, learning analytics </w:t>
+        <w:t xml:space="preserve">which are key components of the SRL cycle (Zimmerman &amp; Schunk, 2011; </w:t>
+      </w:r>
+      <w:proofErr w:type="spellStart"/>
+      <w:r>
+        <w:t>Ifenthaler</w:t>
+      </w:r>
+      <w:proofErr w:type="spellEnd"/>
+      <w:r>
+        <w:t xml:space="preserve"> &amp; Yau, 2020). Through personalised and timely feedback, learning analytics </w:t>
       </w:r>
       <w:r>
         <w:t>aids</w:t>
@@ -3681,7 +4054,15 @@
     <w:p/>
     <w:p>
       <w:r>
-        <w:t>Artificial intelligence assists and enhances the functions of learning analytics with its capability of automatic interpretation, prediction and adaptive intervention. Given the ability of AI systems to process learning analytics data within seconds, they can provide both personalised feedback to support learners in the process of regulating goals, strategies and behaviours (Molenaar et al., 2023; Wu et al., 2026). This way, AI will serve as a kind of external regulator that will supplement the internal processes of self-regulation in learners by encouraging them to reflect, alter their strategies and work on their tasks when necessary.</w:t>
+        <w:t xml:space="preserve">Artificial intelligence assists and enhances the functions of learning analytics with its capability of automatic interpretation, prediction and adaptive intervention. Given the ability of AI systems to process learning analytics data within seconds, they can provide both personalised feedback to support learners in the process of regulating goals, strategies and </w:t>
+      </w:r>
+      <w:proofErr w:type="spellStart"/>
+      <w:r>
+        <w:t>behaviours</w:t>
+      </w:r>
+      <w:proofErr w:type="spellEnd"/>
+      <w:r>
+        <w:t xml:space="preserve"> (Molenaar et al., 2023; Wu et al., 2026). This way, AI will serve as a kind of external regulator that will supplement the internal processes of self-regulation in learners by encouraging them to reflect, alter their strategies and work on their tasks when necessary.</w:t>
       </w:r>
     </w:p>
     <w:p/>
@@ -3693,13 +4074,29 @@
         <w:t xml:space="preserve"> </w:t>
       </w:r>
       <w:r>
-        <w:t>based analysis that creates adaptive feedback and personalised support that affects subsequent learning behaviours (Tang, 2024). The process allows implementing proactive interventions that facilitate the capacity of students to regulate their learning in autonomous contexts of higher learning (Lim et al., 2021; Sedrakyan et al., 2020).</w:t>
+        <w:t xml:space="preserve">based analysis that creates adaptive feedback and personalised support that affects subsequent learning </w:t>
+      </w:r>
+      <w:proofErr w:type="spellStart"/>
+      <w:r>
+        <w:t>behaviours</w:t>
+      </w:r>
+      <w:proofErr w:type="spellEnd"/>
+      <w:r>
+        <w:t xml:space="preserve"> (Tang, 2024). The process allows implementing proactive interventions that facilitate the capacity of students to regulate their learning in autonomous contexts of higher learning (Lim et al., 2021; Sedrakyan et al., 2020).</w:t>
       </w:r>
     </w:p>
     <w:p/>
     <w:p>
       <w:r>
-        <w:t>Ethical and trustworthy implementations of these technologies are also important to make them effective. According to Drachsler and Greller (2016), the learning analytics and AI systems should strike a balance between the capabilities of the systems to the rights of the learners, transparency, data protection and informed consent. It is highly important that the systems and learners can build trust so that meaningful data exchange and personalised support become possible.</w:t>
+        <w:t xml:space="preserve">Ethical and trustworthy implementations of these technologies are also important to make them effective. According to </w:t>
+      </w:r>
+      <w:proofErr w:type="spellStart"/>
+      <w:r>
+        <w:t>Drachsler</w:t>
+      </w:r>
+      <w:proofErr w:type="spellEnd"/>
+      <w:r>
+        <w:t xml:space="preserve"> and Greller (2016), the learning analytics and AI systems should strike a balance between the capabilities of the systems to the rights of the learners, transparency, data protection and informed consent. It is highly important that the systems and learners can build trust so that meaningful data exchange and personalised support become possible.</w:t>
       </w:r>
     </w:p>
     <w:p>
@@ -3708,12 +4105,28 @@
       </w:pPr>
       <w:r>
         <w:lastRenderedPageBreak/>
-        <w:t>Mobile-Based Learning Support and Study Behaviour Regulation</w:t>
-      </w:r>
-    </w:p>
-    <w:p>
-      <w:r>
-        <w:t xml:space="preserve">Mobile-based learning systems can effectively facilitate the regulation of study behaviour in the context of students in the university since smartphones are widely used by students. Mobile learning environments assist learners in dividing their study activities into small and manageable pieces or periods that facilitate time management and involvement in academic activities (Hattie, Sahlberg, </w:t>
+        <w:t xml:space="preserve">Mobile-Based Learning Support and Study </w:t>
+      </w:r>
+      <w:proofErr w:type="spellStart"/>
+      <w:r>
+        <w:t>Behaviour</w:t>
+      </w:r>
+      <w:proofErr w:type="spellEnd"/>
+      <w:r>
+        <w:t xml:space="preserve"> Regulation</w:t>
+      </w:r>
+    </w:p>
+    <w:p>
+      <w:r>
+        <w:t xml:space="preserve">Mobile-based learning systems can effectively facilitate the regulation of study </w:t>
+      </w:r>
+      <w:proofErr w:type="spellStart"/>
+      <w:r>
+        <w:t>behaviour</w:t>
+      </w:r>
+      <w:proofErr w:type="spellEnd"/>
+      <w:r>
+        <w:t xml:space="preserve"> in the context of students in the university since smartphones are widely used by students. Mobile learning environments assist learners in dividing their study activities into small and manageable pieces or periods that facilitate time management and involvement in academic activities (Hattie, Sahlberg, </w:t>
       </w:r>
       <w:r>
         <w:t>&amp;</w:t>
@@ -3731,7 +4144,23 @@
         <w:t xml:space="preserve"> </w:t>
       </w:r>
       <w:r>
-        <w:t>through on the intended study tasks (Nobbe et al., 2024). Mobile-based automatic reminders are more effective at supporting learning behaviours and continuing to be organised and focused on studying, as compared to passive communication, such as emails, or a static learning management system, because they are timelier and more actionable (Lai et al., 2020).</w:t>
+        <w:t xml:space="preserve">through on the intended study tasks (Nobbe et al., 2024). Mobile-based automatic reminders are more effective at supporting learning </w:t>
+      </w:r>
+      <w:proofErr w:type="spellStart"/>
+      <w:r>
+        <w:t>behaviours</w:t>
+      </w:r>
+      <w:proofErr w:type="spellEnd"/>
+      <w:r>
+        <w:t xml:space="preserve"> and continuing to be </w:t>
+      </w:r>
+      <w:proofErr w:type="spellStart"/>
+      <w:r>
+        <w:t>organised</w:t>
+      </w:r>
+      <w:proofErr w:type="spellEnd"/>
+      <w:r>
+        <w:t xml:space="preserve"> and focused on studying, as compared to passive communication, such as emails, or a static learning management system, because they are timelier and more actionable (Lai et al., 2020).</w:t>
       </w:r>
     </w:p>
     <w:p>
@@ -3782,19 +4211,67 @@
         <w:t>,</w:t>
       </w:r>
       <w:r>
-        <w:t xml:space="preserve"> have been extensively employed in educational settings to deliver regularly adapted learning and customized instructional coverage. Such systems are aimed not only to model the knowledge states of the learners but also to provide customised feedback, support and teaching guidance on the basis of the current learner performance. It has been discovered that self-regulated learning can be facilitated by intelligent tutors who facilitate students to engage actively with learning materials and make decisions supported by information regarding how and when to access teaching aids (Nagashima et al., 2022).</w:t>
+        <w:t xml:space="preserve"> have been extensively employed in educational settings to deliver regularly adapted learning and customized instructional coverage. Such systems are aimed not only to model the knowledge states of the learners but also to provide </w:t>
+      </w:r>
+      <w:proofErr w:type="spellStart"/>
+      <w:r>
+        <w:t>customised</w:t>
+      </w:r>
+      <w:proofErr w:type="spellEnd"/>
+      <w:r>
+        <w:t xml:space="preserve"> feedback, support and teaching guidance on the basis of the current learner performance. It has been discovered that self-regulated learning can be facilitated by intelligent tutors who facilitate students to engage actively with learning materials and make decisions supported by information regarding how and when to access teaching aids (Nagashima et al., 2022).</w:t>
       </w:r>
     </w:p>
     <w:p/>
     <w:p>
       <w:r>
-        <w:t>The use of intelligent tutoring systems by students is significant in the process of learning. Nagashima et al. (2022) have discovered that students who constantly interacted with AI offered assistance like the selection of visual representations that is based on self-observation demonstrated higher learning development than students who depended on the prompts of the reactive system. This is an indication that intelligent tutoring systems will be effective when they motivate learners to be able to manage their learning behaviours as opposed to unknowingly following system direction.</w:t>
+        <w:t xml:space="preserve">The use of intelligent tutoring systems by students is significant in the process of learning. Nagashima et al. (2022) have discovered that students who constantly interacted with AI offered assistance like the selection of visual representations that is based on self-observation demonstrated higher learning development than students who depended on the prompts of the reactive system. This is an indication that intelligent tutoring systems will be effective when they motivate learners to be able to manage their learning </w:t>
+      </w:r>
+      <w:proofErr w:type="spellStart"/>
+      <w:r>
+        <w:t>behaviours</w:t>
+      </w:r>
+      <w:proofErr w:type="spellEnd"/>
+      <w:r>
+        <w:t xml:space="preserve"> as opposed to unknowingly following system direction.</w:t>
       </w:r>
     </w:p>
     <w:p/>
     <w:p>
       <w:r>
-        <w:t xml:space="preserve">Modern intelligent tutoring systems rely on data driven learner modelling techniques to help provide adaptive instructions. Stinar et al. (2025) identify Bayesian Knowledge Tracing (BKT) as brilliant approach used to estimate learners’ ability to master specific skills by continuously updating incomplete knowledge states based on performance data. Systems such as Carnegie Learning’s MATHia employ BKT to personalise learning paths and provide </w:t>
+        <w:t xml:space="preserve">Modern intelligent tutoring systems rely on data driven learner modelling techniques to help provide adaptive instructions. Stinar et al. (2025) identify Bayesian Knowledge Tracing (BKT) as brilliant approach used to estimate </w:t>
+      </w:r>
+      <w:proofErr w:type="spellStart"/>
+      <w:r>
+        <w:t>learnersâ</w:t>
+      </w:r>
+      <w:proofErr w:type="spellEnd"/>
+      <w:r>
+        <w:t xml:space="preserve">€™ ability to master specific skills by continuously updating incomplete knowledge states based on performance data. Systems such as Carnegie </w:t>
+      </w:r>
+      <w:proofErr w:type="spellStart"/>
+      <w:r>
+        <w:t>Learningâ</w:t>
+      </w:r>
+      <w:proofErr w:type="spellEnd"/>
+      <w:r>
+        <w:t xml:space="preserve">€™s </w:t>
+      </w:r>
+      <w:proofErr w:type="spellStart"/>
+      <w:r>
+        <w:t>MATHia</w:t>
+      </w:r>
+      <w:proofErr w:type="spellEnd"/>
+      <w:r>
+        <w:t xml:space="preserve"> employ BKT to </w:t>
+      </w:r>
+      <w:proofErr w:type="spellStart"/>
+      <w:r>
+        <w:t>personalise</w:t>
+      </w:r>
+      <w:proofErr w:type="spellEnd"/>
+      <w:r>
+        <w:t xml:space="preserve"> learning paths and provide </w:t>
       </w:r>
       <w:r>
         <w:lastRenderedPageBreak/>
@@ -3859,13 +4336,29 @@
     </w:p>
     <w:p>
       <w:r>
-        <w:t>Learning analytics motivated study support systems are aimed at helping both students and educators to examine the learning information with the purpose to determine the patterns in the data in relation to the risk of academic risk and learning progression. The latest trends indicate that descriptive or predictive analytics are replaced by prescriptive analytics advising on a course of action to enhance learning results (Herodotou et al., 2025). The aim of these systems is to facilitate self-regulation, whereby the systems give the students information and advice to facilitate in decision making in what they study.</w:t>
+        <w:t>Learning analytics motivated study support systems are aimed at helping both students and educators to examine the learning information with the purpose to determine the patterns in the data in relation to the risk of academic risk and learning progression. The latest trends indicate that descriptive or predictive analytics are replaced by prescriptive analytics advising on a course of action to enhance learning results (</w:t>
+      </w:r>
+      <w:proofErr w:type="spellStart"/>
+      <w:r>
+        <w:t>Herodotou</w:t>
+      </w:r>
+      <w:proofErr w:type="spellEnd"/>
+      <w:r>
+        <w:t xml:space="preserve"> et al., 2025). The aim of these systems is to facilitate self-regulation, whereby the systems give the students information and advice to facilitate in decision making in what they study.</w:t>
       </w:r>
     </w:p>
     <w:p/>
     <w:p>
       <w:r>
-        <w:t>Early risk detection is one of the main characteristics of learning analytics based study support systems. According to Hlosta et al. (2022), predictive learning analytics systems use digital learning environment</w:t>
+        <w:t xml:space="preserve">Early risk detection is one of the main characteristics of learning analytics based study support systems. According to </w:t>
+      </w:r>
+      <w:proofErr w:type="spellStart"/>
+      <w:r>
+        <w:t>Hlosta</w:t>
+      </w:r>
+      <w:proofErr w:type="spellEnd"/>
+      <w:r>
+        <w:t xml:space="preserve"> et al. (2022), predictive learning analytics systems use digital learning environment</w:t>
       </w:r>
       <w:r>
         <w:t>s</w:t>
@@ -3877,7 +4370,31 @@
     <w:p/>
     <w:p>
       <w:r>
-        <w:t xml:space="preserve">Large scale institutional implementation is another way of demonstrating the effectiveness of learning analytics driven support systems. According to Boroowa and Herodotou (2022), OU Analyse system utilizes machine learning methods to generate routine predictions of </w:t>
+        <w:t xml:space="preserve">Large scale institutional implementation is another way of demonstrating the effectiveness of learning analytics driven support systems. According to </w:t>
+      </w:r>
+      <w:proofErr w:type="spellStart"/>
+      <w:r>
+        <w:t>Boroowa</w:t>
+      </w:r>
+      <w:proofErr w:type="spellEnd"/>
+      <w:r>
+        <w:t xml:space="preserve"> and </w:t>
+      </w:r>
+      <w:proofErr w:type="spellStart"/>
+      <w:r>
+        <w:t>Herodotou</w:t>
+      </w:r>
+      <w:proofErr w:type="spellEnd"/>
+      <w:r>
+        <w:t xml:space="preserve"> (2022), OU </w:t>
+      </w:r>
+      <w:proofErr w:type="spellStart"/>
+      <w:r>
+        <w:t>Analyse</w:t>
+      </w:r>
+      <w:proofErr w:type="spellEnd"/>
+      <w:r>
+        <w:t xml:space="preserve"> system utilizes machine learning methods to generate routine predictions of </w:t>
       </w:r>
       <w:r>
         <w:lastRenderedPageBreak/>
@@ -3889,12 +4406,28 @@
         <w:pStyle w:val="Heading4"/>
       </w:pPr>
       <w:r>
-        <w:t>OU Analyse (Open University Learning Analytics System)</w:t>
-      </w:r>
-    </w:p>
-    <w:p>
-      <w:r>
-        <w:t>OU Analyse is a learning analytics</w:t>
+        <w:t xml:space="preserve">OU </w:t>
+      </w:r>
+      <w:proofErr w:type="spellStart"/>
+      <w:r>
+        <w:t>Analyse</w:t>
+      </w:r>
+      <w:proofErr w:type="spellEnd"/>
+      <w:r>
+        <w:t xml:space="preserve"> (Open University Learning Analytics System)</w:t>
+      </w:r>
+    </w:p>
+    <w:p>
+      <w:r>
+        <w:t xml:space="preserve">OU </w:t>
+      </w:r>
+      <w:proofErr w:type="spellStart"/>
+      <w:r>
+        <w:t>Analyse</w:t>
+      </w:r>
+      <w:proofErr w:type="spellEnd"/>
+      <w:r>
+        <w:t xml:space="preserve"> is a learning analytics</w:t>
       </w:r>
       <w:r>
         <w:t xml:space="preserve"> </w:t>
@@ -3918,7 +4451,15 @@
         <w:t>e</w:t>
       </w:r>
       <w:r>
-        <w:t xml:space="preserve">, Rebecca Ferguson and Christothea Herodotou. The system was </w:t>
+        <w:t xml:space="preserve">, Rebecca Ferguson and </w:t>
+      </w:r>
+      <w:proofErr w:type="spellStart"/>
+      <w:r>
+        <w:t>Christothea</w:t>
+      </w:r>
+      <w:proofErr w:type="spellEnd"/>
+      <w:r>
+        <w:t xml:space="preserve"> Herodotou. The system was </w:t>
       </w:r>
       <w:r>
         <w:t>made</w:t>
@@ -3948,13 +4489,37 @@
     <w:p/>
     <w:p>
       <w:r>
-        <w:t>The system operates by analysing data from multiple sources including virtual learning environment interactions, assessment records and student demographic information. OU Analyse generates regular predictions related to student engagement and assignment submission</w:t>
+        <w:t xml:space="preserve">The system operates by </w:t>
+      </w:r>
+      <w:proofErr w:type="spellStart"/>
+      <w:r>
+        <w:t>analysing</w:t>
+      </w:r>
+      <w:proofErr w:type="spellEnd"/>
+      <w:r>
+        <w:t xml:space="preserve"> data from multiple sources including virtual learning environment interactions, assessment records and student demographic information. OU </w:t>
+      </w:r>
+      <w:proofErr w:type="spellStart"/>
+      <w:r>
+        <w:t>Analyse</w:t>
+      </w:r>
+      <w:proofErr w:type="spellEnd"/>
+      <w:r>
+        <w:t xml:space="preserve"> generates regular predictions related to student engagement and assignment submission</w:t>
       </w:r>
       <w:r>
         <w:t xml:space="preserve"> while making use of machine learning models</w:t>
       </w:r>
       <w:r>
-        <w:t>. These predictions are used to provide instructors and support staff with insights that enable early, proactive and targeted interventions aimed at improving students’ study progression and retention.</w:t>
+        <w:t xml:space="preserve">. These predictions are used to provide instructors and support staff with insights that enable early, proactive and targeted interventions aimed at improving </w:t>
+      </w:r>
+      <w:proofErr w:type="spellStart"/>
+      <w:r>
+        <w:t>studentsâ</w:t>
+      </w:r>
+      <w:proofErr w:type="spellEnd"/>
+      <w:r>
+        <w:t>€™ study progression and retention.</w:t>
       </w:r>
     </w:p>
     <w:p>
@@ -3967,20 +4532,68 @@
     </w:p>
     <w:p>
       <w:r>
-        <w:t>Adaptive and personalised learning systems are made to align learning experiences to individual learners by adjusting content, feedback and instructions based on learner characteristics and performance. These systems address the limitations of traditional one size fits all instructional methods by providing customised learning experiences that respond to individual learner needs, preferences and progress (Chu et al., 2022).</w:t>
+        <w:t xml:space="preserve">Adaptive and personalised learning systems are made to align learning experiences to individual learners by adjusting content, feedback and instructions based on learner characteristics and performance. These systems address the limitations of traditional one size fits all instructional methods by providing </w:t>
+      </w:r>
+      <w:proofErr w:type="spellStart"/>
+      <w:r>
+        <w:t>customised</w:t>
+      </w:r>
+      <w:proofErr w:type="spellEnd"/>
+      <w:r>
+        <w:t xml:space="preserve"> learning experiences that respond to individual learner needs, preferences and progress (Chu et al., 2022).</w:t>
       </w:r>
     </w:p>
     <w:p/>
     <w:p>
       <w:r>
         <w:lastRenderedPageBreak/>
-        <w:t>Research indicates that adaptive learning systems support learning by integrating step by step supporting mechanisms that enhance learners’ metacognitive and self-regulatory processes. Ouyang (2025) explains that such systems act as psychological tools that interact with learners’ internal regulation processes enabling improved monitoring, control and engagement during learning activities. Through these adaptive features, personalised environments promote better engagement and improved academic outcomes by first strengthening self-regulated learning behaviours.</w:t>
+        <w:t xml:space="preserve">Research indicates that adaptive learning systems support learning by integrating step by step supporting mechanisms that enhance </w:t>
+      </w:r>
+      <w:proofErr w:type="spellStart"/>
+      <w:r>
+        <w:t>learnersâ</w:t>
+      </w:r>
+      <w:proofErr w:type="spellEnd"/>
+      <w:r>
+        <w:t xml:space="preserve">€™ metacognitive and self-regulatory processes. Ouyang (2025) explains that such systems act as psychological tools that interact with </w:t>
+      </w:r>
+      <w:proofErr w:type="spellStart"/>
+      <w:r>
+        <w:t>learnersâ</w:t>
+      </w:r>
+      <w:proofErr w:type="spellEnd"/>
+      <w:r>
+        <w:t xml:space="preserve">€™ internal regulation processes enabling improved monitoring, control and engagement during learning activities. Through these adaptive features, personalised environments promote better engagement and improved academic outcomes by first strengthening self-regulated learning </w:t>
+      </w:r>
+      <w:proofErr w:type="spellStart"/>
+      <w:r>
+        <w:t>behaviours</w:t>
+      </w:r>
+      <w:proofErr w:type="spellEnd"/>
+      <w:r>
+        <w:t>.</w:t>
       </w:r>
     </w:p>
     <w:p/>
     <w:p>
       <w:r>
-        <w:t xml:space="preserve">The point of view of the system design shows how adaptive learning environments depend on organised models aid personalisation processes. </w:t>
+        <w:t xml:space="preserve">The point of view of the system design shows how adaptive learning environments depend on </w:t>
+      </w:r>
+      <w:proofErr w:type="spellStart"/>
+      <w:r>
+        <w:t>organised</w:t>
+      </w:r>
+      <w:proofErr w:type="spellEnd"/>
+      <w:r>
+        <w:t xml:space="preserve"> models aid </w:t>
+      </w:r>
+      <w:proofErr w:type="spellStart"/>
+      <w:r>
+        <w:t>personalisation</w:t>
+      </w:r>
+      <w:proofErr w:type="spellEnd"/>
+      <w:r>
+        <w:t xml:space="preserve"> processes. </w:t>
       </w:r>
       <w:r>
         <w:t>According to Luckin et al. (2016), these systems are characterized by a learner model</w:t>
@@ -3996,25 +4609,56 @@
       <w:pPr>
         <w:pStyle w:val="Heading4"/>
       </w:pPr>
-      <w:r>
-        <w:t>Knewton Adaptive Learning Platform</w:t>
-      </w:r>
-    </w:p>
-    <w:p>
-      <w:r>
-        <w:t xml:space="preserve">Knewton is an adaptive learning platform developed by Knewton Inc. The platform was designed to </w:t>
+      <w:proofErr w:type="spellStart"/>
+      <w:r>
+        <w:t>Knewton</w:t>
+      </w:r>
+      <w:proofErr w:type="spellEnd"/>
+      <w:r>
+        <w:t xml:space="preserve"> Adaptive Learning Platform</w:t>
+      </w:r>
+    </w:p>
+    <w:p>
+      <w:proofErr w:type="spellStart"/>
+      <w:r>
+        <w:t>Knewton</w:t>
+      </w:r>
+      <w:proofErr w:type="spellEnd"/>
+      <w:r>
+        <w:t xml:space="preserve"> is an adaptive learning platform developed by </w:t>
+      </w:r>
+      <w:proofErr w:type="spellStart"/>
+      <w:r>
+        <w:t>Knewton</w:t>
+      </w:r>
+      <w:proofErr w:type="spellEnd"/>
+      <w:r>
+        <w:t xml:space="preserve"> Inc. The platform was designed to </w:t>
       </w:r>
       <w:r>
         <w:t>produce</w:t>
       </w:r>
       <w:r>
-        <w:t xml:space="preserve"> personalised learning experiences by analysing learner performance data and adjusting instructional content in real time.</w:t>
+        <w:t xml:space="preserve"> personalised learning experiences by </w:t>
+      </w:r>
+      <w:proofErr w:type="spellStart"/>
+      <w:r>
+        <w:t>analysing</w:t>
+      </w:r>
+      <w:proofErr w:type="spellEnd"/>
+      <w:r>
+        <w:t xml:space="preserve"> learner performance data and adjusting instructional content in real time.</w:t>
       </w:r>
     </w:p>
     <w:p/>
     <w:p>
-      <w:r>
-        <w:t xml:space="preserve">Knewton </w:t>
+      <w:proofErr w:type="spellStart"/>
+      <w:r>
+        <w:t>Knewton</w:t>
+      </w:r>
+      <w:proofErr w:type="spellEnd"/>
+      <w:r>
+        <w:t xml:space="preserve"> </w:t>
       </w:r>
       <w:r>
         <w:t>was made to function</w:t>
@@ -4032,7 +4676,23 @@
         <w:t>e of</w:t>
       </w:r>
       <w:r>
-        <w:t xml:space="preserve"> algorithms that model learners’ knowledge states and learning behaviours to </w:t>
+        <w:t xml:space="preserve"> algorithms that model </w:t>
+      </w:r>
+      <w:proofErr w:type="spellStart"/>
+      <w:r>
+        <w:t>learnersâ</w:t>
+      </w:r>
+      <w:proofErr w:type="spellEnd"/>
+      <w:r>
+        <w:t xml:space="preserve">€™ knowledge states and learning </w:t>
+      </w:r>
+      <w:proofErr w:type="spellStart"/>
+      <w:r>
+        <w:t>behaviours</w:t>
+      </w:r>
+      <w:proofErr w:type="spellEnd"/>
+      <w:r>
+        <w:t xml:space="preserve"> to </w:t>
       </w:r>
       <w:r>
         <w:t>prescribe</w:t>
@@ -4054,7 +4714,15 @@
       </w:r>
       <w:r>
         <w:lastRenderedPageBreak/>
-        <w:t>interactions, the system adapts content difficulty to match individual learning needs. Knewton has been widely integrated into digital textbooks and online courses</w:t>
+        <w:t xml:space="preserve">interactions, the system adapts content difficulty to match individual learning needs. </w:t>
+      </w:r>
+      <w:proofErr w:type="spellStart"/>
+      <w:r>
+        <w:t>Knewton</w:t>
+      </w:r>
+      <w:proofErr w:type="spellEnd"/>
+      <w:r>
+        <w:t xml:space="preserve"> has been widely integrated into digital textbooks and online courses</w:t>
       </w:r>
       <w:r>
         <w:t xml:space="preserve"> which </w:t>
@@ -4104,7 +4772,15 @@
     </w:p>
     <w:p>
       <w:r>
-        <w:t xml:space="preserve">Although self-regulated learning has been widely recognised as a determinant of academic success in higher education, existing </w:t>
+        <w:t xml:space="preserve">Although self-regulated learning has been widely </w:t>
+      </w:r>
+      <w:proofErr w:type="spellStart"/>
+      <w:r>
+        <w:t>recognised</w:t>
+      </w:r>
+      <w:proofErr w:type="spellEnd"/>
+      <w:r>
+        <w:t xml:space="preserve"> as a determinant of academic success in higher education, existing </w:t>
       </w:r>
       <w:r>
         <w:t>methodologies</w:t>
@@ -4116,7 +4792,15 @@
         <w:t xml:space="preserve"> </w:t>
       </w:r>
       <w:r>
-        <w:t>dependent. Many interventions rely on students’ individual capacity to regulate their learning without providing sustained system</w:t>
+        <w:t xml:space="preserve">dependent. Many interventions rely on </w:t>
+      </w:r>
+      <w:proofErr w:type="spellStart"/>
+      <w:r>
+        <w:t>studentsâ</w:t>
+      </w:r>
+      <w:proofErr w:type="spellEnd"/>
+      <w:r>
+        <w:t>€™ individual capacity to regulate their learning without providing sustained system</w:t>
       </w:r>
       <w:r>
         <w:t xml:space="preserve"> </w:t>
@@ -4134,7 +4818,23 @@
         <w:t>account for</w:t>
       </w:r>
       <w:r>
-        <w:t xml:space="preserve"> students’ evolving learning behaviours. As a result learners</w:t>
+        <w:t xml:space="preserve"> </w:t>
+      </w:r>
+      <w:proofErr w:type="spellStart"/>
+      <w:r>
+        <w:t>studentsâ</w:t>
+      </w:r>
+      <w:proofErr w:type="spellEnd"/>
+      <w:r>
+        <w:t xml:space="preserve">€™ evolving learning </w:t>
+      </w:r>
+      <w:proofErr w:type="spellStart"/>
+      <w:r>
+        <w:t>behaviours</w:t>
+      </w:r>
+      <w:proofErr w:type="spellEnd"/>
+      <w:r>
+        <w:t>. As a result learners</w:t>
       </w:r>
       <w:r>
         <w:t xml:space="preserve"> </w:t>
@@ -4181,7 +4881,15 @@
     <w:p/>
     <w:p>
       <w:r>
-        <w:t xml:space="preserve">Current AI driven systems in educational contexts are often designed as single standalone tools that address specific aspects of learning like content adaptation or performance forecasting. They do not integrate core self-regulated learning processes like goal setting, time management and reflective feedback. This lack of integration reduces their effectiveness in helping students develop good study habits. Many systems are developed and evaluated in well resourced contexts with limited consideration for various constraints in developing higher education environments thereby restricting their applicability and impact in contexts </w:t>
+        <w:t xml:space="preserve">Current AI driven systems in educational contexts are often designed as single standalone tools that address specific aspects of learning like content adaptation or performance forecasting. They do not integrate core self-regulated learning processes like goal setting, time management and reflective feedback. This lack of integration reduces their effectiveness in helping students develop good study habits. Many systems are developed and evaluated in </w:t>
+      </w:r>
+      <w:proofErr w:type="spellStart"/>
+      <w:r>
+        <w:t>well resourced</w:t>
+      </w:r>
+      <w:proofErr w:type="spellEnd"/>
+      <w:r>
+        <w:t xml:space="preserve"> contexts with limited consideration for various constraints in developing higher education environments thereby restricting their applicability and impact in contexts </w:t>
       </w:r>
       <w:r>
         <w:t>like</w:t>
@@ -4256,12 +4964,25 @@
       <w:r>
         <w:t xml:space="preserve"> </w:t>
       </w:r>
-      <w:r>
-        <w:t xml:space="preserve">centred systems </w:t>
+      <w:proofErr w:type="spellStart"/>
+      <w:r>
+        <w:t>centred</w:t>
+      </w:r>
+      <w:proofErr w:type="spellEnd"/>
+      <w:r>
+        <w:t xml:space="preserve"> systems </w:t>
       </w:r>
       <w:r>
         <w:lastRenderedPageBreak/>
-        <w:t xml:space="preserve">designed to support undergraduate learners’ study planning and learning routines. This gap </w:t>
+        <w:t xml:space="preserve">designed to support undergraduate </w:t>
+      </w:r>
+      <w:proofErr w:type="spellStart"/>
+      <w:r>
+        <w:t>learnersâ</w:t>
+      </w:r>
+      <w:proofErr w:type="spellEnd"/>
+      <w:r>
+        <w:t xml:space="preserve">€™ study planning and learning routines. This gap </w:t>
       </w:r>
       <w:r>
         <w:t>points towards</w:t>
@@ -4280,7 +5001,31 @@
     </w:p>
     <w:p>
       <w:r>
-        <w:t xml:space="preserve">To address the identified gaps from the earlier sections, this project proposes an intelligent study support system that integrates self-regulated learning principles, learning analytics, artificial intelligence and learning strategy recommendation. The system functions to generate personalised study timetables or optimise existing ones and recommend appropriate learning strategies based on students’ learning behaviours, academic requirements and individual goals. </w:t>
+        <w:t xml:space="preserve">To address the identified gaps from the earlier sections, this project proposes an intelligent study support system that integrates self-regulated learning principles, learning analytics, artificial intelligence and learning strategy recommendation. The system functions to generate personalised study timetables or </w:t>
+      </w:r>
+      <w:proofErr w:type="spellStart"/>
+      <w:r>
+        <w:t>optimise</w:t>
+      </w:r>
+      <w:proofErr w:type="spellEnd"/>
+      <w:r>
+        <w:t xml:space="preserve"> existing ones and recommend appropriate learning strategies based on </w:t>
+      </w:r>
+      <w:proofErr w:type="spellStart"/>
+      <w:r>
+        <w:t>studentsâ</w:t>
+      </w:r>
+      <w:proofErr w:type="spellEnd"/>
+      <w:r>
+        <w:t xml:space="preserve">€™ learning </w:t>
+      </w:r>
+      <w:proofErr w:type="spellStart"/>
+      <w:r>
+        <w:t>behaviours</w:t>
+      </w:r>
+      <w:proofErr w:type="spellEnd"/>
+      <w:r>
+        <w:t xml:space="preserve">, academic requirements and individual goals. </w:t>
       </w:r>
       <w:r>
         <w:t>The system offers adaptive guidance and focused feedback and strategy recommendations through the interaction data of the learners. The objective of this approach is to enhance sustainable study behavior and enhance academic achievement among undergraduate students, more so in the Nigerian higher education setting.</w:t>
@@ -4329,13 +5074,21 @@
         <w:t>,</w:t>
       </w:r>
       <w:r>
-        <w:t xml:space="preserve"> performance, and self</w:t>
+        <w:t xml:space="preserve"> performance, and </w:t>
+      </w:r>
+      <w:proofErr w:type="spellStart"/>
+      <w:r>
+        <w:t>self</w:t>
       </w:r>
       <w:r>
         <w:t xml:space="preserve"> </w:t>
       </w:r>
       <w:r>
-        <w:t xml:space="preserve">reflection. </w:t>
+        <w:t>reflection</w:t>
+      </w:r>
+      <w:proofErr w:type="spellEnd"/>
+      <w:r>
+        <w:t xml:space="preserve">. </w:t>
       </w:r>
       <w:r>
         <w:t>It was also established that students</w:t>
@@ -4356,7 +5109,15 @@
         <w:t xml:space="preserve"> </w:t>
       </w:r>
       <w:r>
-        <w:t>driven insights to enhance students’ learning experiences.</w:t>
+        <w:t xml:space="preserve">driven insights to enhance </w:t>
+      </w:r>
+      <w:proofErr w:type="spellStart"/>
+      <w:r>
+        <w:t>studentsâ</w:t>
+      </w:r>
+      <w:proofErr w:type="spellEnd"/>
+      <w:r>
+        <w:t>€™ learning experiences.</w:t>
       </w:r>
     </w:p>
     <w:p/>
@@ -4365,9 +5126,11 @@
         <w:lastRenderedPageBreak/>
         <w:t xml:space="preserve">The related works </w:t>
       </w:r>
+      <w:proofErr w:type="spellStart"/>
       <w:r>
         <w:t>analysed</w:t>
       </w:r>
+      <w:proofErr w:type="spellEnd"/>
       <w:r>
         <w:t xml:space="preserve"> existing AI</w:t>
       </w:r>
@@ -4522,8 +5285,13 @@
         <w:t xml:space="preserve">. </w:t>
       </w:r>
       <w:r>
-        <w:t>The first selected system is MyStudyLife</w:t>
-      </w:r>
+        <w:t xml:space="preserve">The first selected system is </w:t>
+      </w:r>
+      <w:proofErr w:type="spellStart"/>
+      <w:r>
+        <w:t>MyStudyLife</w:t>
+      </w:r>
+      <w:proofErr w:type="spellEnd"/>
       <w:r>
         <w:t xml:space="preserve"> which is</w:t>
       </w:r>
@@ -4540,13 +5308,26 @@
         <w:t xml:space="preserve">used </w:t>
       </w:r>
       <w:r>
-        <w:t>to help students organise their academic schedules.</w:t>
+        <w:t xml:space="preserve">to help students </w:t>
+      </w:r>
+      <w:proofErr w:type="spellStart"/>
+      <w:r>
+        <w:t>organise</w:t>
+      </w:r>
+      <w:proofErr w:type="spellEnd"/>
+      <w:r>
+        <w:t xml:space="preserve"> their academic schedules.</w:t>
       </w:r>
     </w:p>
     <w:p/>
     <w:p>
-      <w:r>
-        <w:t xml:space="preserve">MyStudyLife as in </w:t>
+      <w:proofErr w:type="spellStart"/>
+      <w:r>
+        <w:t>MyStudyLife</w:t>
+      </w:r>
+      <w:proofErr w:type="spellEnd"/>
+      <w:r>
+        <w:t xml:space="preserve"> as in </w:t>
       </w:r>
       <w:r>
         <w:rPr>
@@ -4595,19 +5376,43 @@
         <w:t>accessible</w:t>
       </w:r>
       <w:r>
-        <w:t xml:space="preserve"> and supports students in organising their academic activities across </w:t>
+        <w:t xml:space="preserve"> and supports students in </w:t>
+      </w:r>
+      <w:proofErr w:type="spellStart"/>
+      <w:r>
+        <w:t>organising</w:t>
+      </w:r>
+      <w:proofErr w:type="spellEnd"/>
+      <w:r>
+        <w:t xml:space="preserve"> their academic activities across </w:t>
       </w:r>
       <w:r>
         <w:t xml:space="preserve">their personal </w:t>
       </w:r>
       <w:r>
-        <w:t xml:space="preserve">devices. MyStudyLife captures aspects of </w:t>
+        <w:t xml:space="preserve">devices. </w:t>
+      </w:r>
+      <w:proofErr w:type="spellStart"/>
+      <w:r>
+        <w:t>MyStudyLife</w:t>
+      </w:r>
+      <w:proofErr w:type="spellEnd"/>
+      <w:r>
+        <w:t xml:space="preserve"> captures aspects of </w:t>
       </w:r>
       <w:r>
         <w:t xml:space="preserve">proper </w:t>
       </w:r>
       <w:r>
-        <w:t>study organisation that are relevant to personalised study planning</w:t>
+        <w:t xml:space="preserve">study </w:t>
+      </w:r>
+      <w:proofErr w:type="spellStart"/>
+      <w:r>
+        <w:t>organisation</w:t>
+      </w:r>
+      <w:proofErr w:type="spellEnd"/>
+      <w:r>
+        <w:t xml:space="preserve"> that are relevant to personalised study planning</w:t>
       </w:r>
       <w:r>
         <w:t xml:space="preserve"> through its scheduling and reminder functionalities</w:t>
@@ -4781,7 +5586,23 @@
           <w:i/>
           <w:iCs/>
         </w:rPr>
-        <w:t xml:space="preserve"> MyStudyLife Snapshot</w:t>
+        <w:t xml:space="preserve"> </w:t>
+      </w:r>
+      <w:proofErr w:type="spellStart"/>
+      <w:r>
+        <w:rPr>
+          <w:i/>
+          <w:iCs/>
+        </w:rPr>
+        <w:t>MyStudyLife</w:t>
+      </w:r>
+      <w:proofErr w:type="spellEnd"/>
+      <w:r>
+        <w:rPr>
+          <w:i/>
+          <w:iCs/>
+        </w:rPr>
+        <w:t xml:space="preserve"> Snapshot</w:t>
       </w:r>
     </w:p>
     <w:p>
@@ -4810,7 +5631,7 @@
             <wp:extent cx="2857500" cy="2357755"/>
             <wp:effectExtent l="0" t="0" r="0" b="4445"/>
             <wp:wrapNone/>
-            <wp:docPr id="332240875" name="Picture 2" descr="Brightspace Tip #372: Is Your Course Pulse Friendly? – CAT FooD"/>
+            <wp:docPr id="332240875" name="Picture 2" descr="Brightspace Tip #372: Is Your Course Pulse Friendly? â€“ CAT FooD"/>
             <wp:cNvGraphicFramePr>
               <a:graphicFrameLocks xmlns:a="http://schemas.openxmlformats.org/drawingml/2006/main" noChangeAspect="1"/>
             </wp:cNvGraphicFramePr>
@@ -4818,7 +5639,7 @@
               <a:graphicData uri="http://schemas.openxmlformats.org/drawingml/2006/picture">
                 <pic:pic xmlns:pic="http://schemas.openxmlformats.org/drawingml/2006/picture">
                   <pic:nvPicPr>
-                    <pic:cNvPr id="0" name="Picture 3" descr="Brightspace Tip #372: Is Your Course Pulse Friendly? – CAT FooD"/>
+                    <pic:cNvPr id="0" name="Picture 3" descr="Brightspace Tip #372: Is Your Course Pulse Friendly? â€“ CAT FooD"/>
                     <pic:cNvPicPr>
                       <a:picLocks noChangeAspect="1" noChangeArrowheads="1"/>
                     </pic:cNvPicPr>
@@ -4979,7 +5800,23 @@
     <w:p>
       <w:r>
         <w:lastRenderedPageBreak/>
-        <w:t xml:space="preserve">The final case study is Carnegie Learning’s Cognitive Tutor (MATHia) </w:t>
+        <w:t xml:space="preserve">The final case study is Carnegie </w:t>
+      </w:r>
+      <w:proofErr w:type="spellStart"/>
+      <w:r>
+        <w:t>Learningâ</w:t>
+      </w:r>
+      <w:proofErr w:type="spellEnd"/>
+      <w:r>
+        <w:t>€™s Cognitive Tutor (</w:t>
+      </w:r>
+      <w:proofErr w:type="spellStart"/>
+      <w:r>
+        <w:t>MATHia</w:t>
+      </w:r>
+      <w:proofErr w:type="spellEnd"/>
+      <w:r>
+        <w:t xml:space="preserve">) </w:t>
       </w:r>
       <w:r>
         <w:t>which is</w:t>
@@ -5025,7 +5862,15 @@
         <w:t>adjust</w:t>
       </w:r>
       <w:r>
-        <w:t xml:space="preserve"> content, feedback and problem difficulty. Carnegie Learning demonstrates how artificial intelligence can be applied to personalise learning support</w:t>
+        <w:t xml:space="preserve"> content, feedback and problem difficulty. Carnegie Learning demonstrates how artificial intelligence can be applied to </w:t>
+      </w:r>
+      <w:proofErr w:type="spellStart"/>
+      <w:r>
+        <w:t>personalise</w:t>
+      </w:r>
+      <w:proofErr w:type="spellEnd"/>
+      <w:r>
+        <w:t xml:space="preserve"> learning support</w:t>
       </w:r>
       <w:r>
         <w:t xml:space="preserve"> by aligning learning experiences to individual learners</w:t>
@@ -5043,7 +5888,15 @@
         <w:t>has</w:t>
       </w:r>
       <w:r>
-        <w:t xml:space="preserve"> the potential of AI-driven personalisation that informs the design of intelligent study support solutions.</w:t>
+        <w:t xml:space="preserve"> the potential of AI-driven </w:t>
+      </w:r>
+      <w:proofErr w:type="spellStart"/>
+      <w:r>
+        <w:t>personalisation</w:t>
+      </w:r>
+      <w:proofErr w:type="spellEnd"/>
+      <w:r>
+        <w:t xml:space="preserve"> that informs the design of intelligent study support solutions.</w:t>
       </w:r>
     </w:p>
     <w:p>
@@ -5215,7 +6068,15 @@
         <w:t xml:space="preserve">and study planning </w:t>
       </w:r>
       <w:r>
-        <w:t xml:space="preserve">to assist students with study organisation. </w:t>
+        <w:t xml:space="preserve">to assist students with study </w:t>
+      </w:r>
+      <w:proofErr w:type="spellStart"/>
+      <w:r>
+        <w:t>organisation</w:t>
+      </w:r>
+      <w:proofErr w:type="spellEnd"/>
+      <w:r>
+        <w:t xml:space="preserve">. </w:t>
       </w:r>
       <w:r>
         <w:t>T</w:t>
@@ -5247,15 +6108,36 @@
     </w:p>
     <w:p/>
     <w:p>
+      <w:proofErr w:type="spellStart"/>
       <w:r>
         <w:lastRenderedPageBreak/>
-        <w:t>MyStudyLife offers simple scheduling and reminder capabilities but instead of depending on dynamic structures of timetables they require hand</w:t>
+        <w:t>MyStudyLife</w:t>
+      </w:r>
+      <w:proofErr w:type="spellEnd"/>
+      <w:r>
+        <w:t xml:space="preserve"> offers simple scheduling and reminder capabilities but instead of depending on dynamic structures of timetables they require hand</w:t>
       </w:r>
       <w:r>
         <w:t xml:space="preserve"> </w:t>
       </w:r>
       <w:r>
-        <w:t xml:space="preserve">entry maintenance and manual scheduling. Although it aids in the organisation of studies, it does not add value to examining the academic performance, study behaviour and learning preferences of learners to </w:t>
+        <w:t xml:space="preserve">entry maintenance and manual scheduling. Although it aids in the </w:t>
+      </w:r>
+      <w:proofErr w:type="spellStart"/>
+      <w:r>
+        <w:t>organisation</w:t>
+      </w:r>
+      <w:proofErr w:type="spellEnd"/>
+      <w:r>
+        <w:t xml:space="preserve"> of studies, it does not add value to examining the academic performance, study </w:t>
+      </w:r>
+      <w:proofErr w:type="spellStart"/>
+      <w:r>
+        <w:t>behaviour</w:t>
+      </w:r>
+      <w:proofErr w:type="spellEnd"/>
+      <w:r>
+        <w:t xml:space="preserve"> and learning preferences of learners to </w:t>
       </w:r>
       <w:r>
         <w:t>help in</w:t>
@@ -5288,7 +6170,15 @@
         <w:t xml:space="preserve"> but</w:t>
       </w:r>
       <w:r>
-        <w:t xml:space="preserve"> personalisation is restricted to subject</w:t>
+        <w:t xml:space="preserve"> </w:t>
+      </w:r>
+      <w:proofErr w:type="spellStart"/>
+      <w:r>
+        <w:t>personalisation</w:t>
+      </w:r>
+      <w:proofErr w:type="spellEnd"/>
+      <w:r>
+        <w:t xml:space="preserve"> is restricted to subject</w:t>
       </w:r>
       <w:r>
         <w:t xml:space="preserve"> </w:t>
@@ -5380,8 +6270,29 @@
         <w:t xml:space="preserve">provide </w:t>
       </w:r>
       <w:r>
-        <w:t>learning strategy advice. The system is able to coordinate and optimise study activities across courses by analysing learner behaviour</w:t>
-      </w:r>
+        <w:t xml:space="preserve">learning strategy advice. The system is able to coordinate and </w:t>
+      </w:r>
+      <w:proofErr w:type="spellStart"/>
+      <w:r>
+        <w:t>optimise</w:t>
+      </w:r>
+      <w:proofErr w:type="spellEnd"/>
+      <w:r>
+        <w:t xml:space="preserve"> study activities across courses by </w:t>
+      </w:r>
+      <w:proofErr w:type="spellStart"/>
+      <w:r>
+        <w:t>analysing</w:t>
+      </w:r>
+      <w:proofErr w:type="spellEnd"/>
+      <w:r>
+        <w:t xml:space="preserve"> learner </w:t>
+      </w:r>
+      <w:proofErr w:type="spellStart"/>
+      <w:r>
+        <w:t>behaviour</w:t>
+      </w:r>
+      <w:proofErr w:type="spellEnd"/>
       <w:r>
         <w:t xml:space="preserve"> and</w:t>
       </w:r>
@@ -5403,8 +6314,13 @@
       <w:r>
         <w:t xml:space="preserve"> </w:t>
       </w:r>
-      <w:r>
-        <w:t>centred approach to the learning process that facilitates good study habits and academic success.</w:t>
+      <w:proofErr w:type="spellStart"/>
+      <w:r>
+        <w:t>centred</w:t>
+      </w:r>
+      <w:proofErr w:type="spellEnd"/>
+      <w:r>
+        <w:t xml:space="preserve"> approach to the learning process that facilitates good study habits and academic success.</w:t>
       </w:r>
     </w:p>
     <w:p>
@@ -5448,7 +6364,15 @@
     </w:p>
     <w:p>
       <w:r>
-        <w:t xml:space="preserve">Unified Modeling Language (UML) is used in this study to visually represent the structure and behaviour of the proposed intelligent study support system. UML diagrams provide </w:t>
+        <w:t xml:space="preserve">Unified Modeling Language (UML) is used in this study to visually represent the structure and </w:t>
+      </w:r>
+      <w:proofErr w:type="spellStart"/>
+      <w:r>
+        <w:t>behaviour</w:t>
+      </w:r>
+      <w:proofErr w:type="spellEnd"/>
+      <w:r>
+        <w:t xml:space="preserve"> of the proposed intelligent study support system. UML diagrams provide </w:t>
       </w:r>
       <w:r>
         <w:lastRenderedPageBreak/>
@@ -5472,7 +6396,15 @@
         <w:t>Figure 3.4</w:t>
       </w:r>
       <w:r>
-        <w:t xml:space="preserve"> illustrates the use case diagram of the proposed AI-powered personalised study planning and learning recommendation system. It shows the student as the primary actor interacting with the system to perform key functions such as registering and logging in, inputting academic details, specifying study time and preferences, planning study goals, generating and optimising personalised study timetables, receiving learning strategy recommendations, tracking study progress and performance, reviewing feedback, and receiving intelligent reminders and notifications. The diagram highlights how the system supports effective study planning and self-regulated learning through continuous and adaptive user interaction.</w:t>
+        <w:t xml:space="preserve"> illustrates the use case diagram of the proposed AI-powered personalised study planning and learning recommendation system. It shows the student as the primary actor interacting with the system to perform key functions such as registering and logging in, inputting academic details, specifying study time and preferences, planning study goals, generating and </w:t>
+      </w:r>
+      <w:proofErr w:type="spellStart"/>
+      <w:r>
+        <w:t>optimising</w:t>
+      </w:r>
+      <w:proofErr w:type="spellEnd"/>
+      <w:r>
+        <w:t xml:space="preserve"> personalised study timetables, receiving learning strategy recommendations, tracking study progress and performance, reviewing feedback, and receiving intelligent reminders and notifications. The diagram highlights how the system supports effective study planning and self-regulated learning through continuous and adaptive user interaction.</w:t>
       </w:r>
     </w:p>
     <w:p/>
@@ -5656,6 +6588,7 @@
       <w:r>
         <w:t xml:space="preserve"> the </w:t>
       </w:r>
+      <w:proofErr w:type="spellStart"/>
       <w:r>
         <w:rPr>
           <w:i/>
@@ -5663,9 +6596,11 @@
         </w:rPr>
         <w:t>RecommendationEngine</w:t>
       </w:r>
+      <w:proofErr w:type="spellEnd"/>
       <w:r>
         <w:t xml:space="preserve"> and </w:t>
       </w:r>
+      <w:proofErr w:type="spellStart"/>
       <w:r>
         <w:rPr>
           <w:i/>
@@ -5673,6 +6608,7 @@
         </w:rPr>
         <w:t>ProgressTracker</w:t>
       </w:r>
+      <w:proofErr w:type="spellEnd"/>
       <w:r>
         <w:t xml:space="preserve"> support </w:t>
       </w:r>
@@ -5691,6 +6627,7 @@
       <w:r>
         <w:t xml:space="preserve">like </w:t>
       </w:r>
+      <w:proofErr w:type="spellStart"/>
       <w:r>
         <w:rPr>
           <w:i/>
@@ -5698,6 +6635,7 @@
         </w:rPr>
         <w:t>StudySession</w:t>
       </w:r>
+      <w:proofErr w:type="spellEnd"/>
       <w:r>
         <w:t xml:space="preserve"> and </w:t>
       </w:r>
@@ -5993,7 +6931,23 @@
         <w:t>Figure 3.7b</w:t>
       </w:r>
       <w:r>
-        <w:t xml:space="preserve"> shows the study monitoring and optimisation workflow where the data on the study activity and performance are monitored and analysed to decide whether some adjustments have to be made thus allowing the timetable to be optimised, the strategy to be updated, intelligent reminders and reflective learning support.</w:t>
+        <w:t xml:space="preserve"> shows the study monitoring and optimisation workflow where the data on the study activity and performance are monitored and </w:t>
+      </w:r>
+      <w:proofErr w:type="spellStart"/>
+      <w:r>
+        <w:t>analysed</w:t>
+      </w:r>
+      <w:proofErr w:type="spellEnd"/>
+      <w:r>
+        <w:t xml:space="preserve"> to decide whether some adjustments have to be made thus allowing the timetable to be </w:t>
+      </w:r>
+      <w:proofErr w:type="spellStart"/>
+      <w:r>
+        <w:t>optimised</w:t>
+      </w:r>
+      <w:proofErr w:type="spellEnd"/>
+      <w:r>
+        <w:t>, the strategy to be updated, intelligent reminders and reflective learning support.</w:t>
       </w:r>
     </w:p>
     <w:p/>
@@ -6748,7 +7702,23 @@
         <w:t>Adaptive Intelligence:</w:t>
       </w:r>
       <w:r>
-        <w:t xml:space="preserve"> Enables the system to analyse learner behaviour and performance data.</w:t>
+        <w:t xml:space="preserve"> Enables the system to </w:t>
+      </w:r>
+      <w:proofErr w:type="spellStart"/>
+      <w:r>
+        <w:t>analyse</w:t>
+      </w:r>
+      <w:proofErr w:type="spellEnd"/>
+      <w:r>
+        <w:t xml:space="preserve"> learner </w:t>
+      </w:r>
+      <w:proofErr w:type="spellStart"/>
+      <w:r>
+        <w:t>behaviour</w:t>
+      </w:r>
+      <w:proofErr w:type="spellEnd"/>
+      <w:r>
+        <w:t xml:space="preserve"> and performance data.</w:t>
       </w:r>
     </w:p>
     <w:p>
@@ -6776,8 +7746,21 @@
       <w:r>
         <w:t xml:space="preserve"> </w:t>
       </w:r>
-      <w:r>
-        <w:t>Utilises basic machine learning models provided by scikit-learn to identify patterns in study behaviour.</w:t>
+      <w:proofErr w:type="spellStart"/>
+      <w:r>
+        <w:t>Utilises</w:t>
+      </w:r>
+      <w:proofErr w:type="spellEnd"/>
+      <w:r>
+        <w:t xml:space="preserve"> basic machine learning models provided by scikit-learn to identify patterns in study </w:t>
+      </w:r>
+      <w:proofErr w:type="spellStart"/>
+      <w:r>
+        <w:t>behaviour</w:t>
+      </w:r>
+      <w:proofErr w:type="spellEnd"/>
+      <w:r>
+        <w:t>.</w:t>
       </w:r>
     </w:p>
     <w:p>
@@ -6842,7 +7825,15 @@
         <w:t xml:space="preserve"> </w:t>
       </w:r>
       <w:r>
-        <w:t>based authentication ensures that only authorised users can access system functionalities.</w:t>
+        <w:t xml:space="preserve">based authentication ensures that only </w:t>
+      </w:r>
+      <w:proofErr w:type="spellStart"/>
+      <w:r>
+        <w:t>authorised</w:t>
+      </w:r>
+      <w:proofErr w:type="spellEnd"/>
+      <w:r>
+        <w:t xml:space="preserve"> users can access system functionalities.</w:t>
       </w:r>
     </w:p>
     <w:p>
@@ -6880,7 +7871,7 @@
     </w:p>
     <w:p>
       <w:r>
-        <w:t>This section presents the methodology for implementing the artificial intelligence component of the proposed AI-powered personalised study planning and learning recommendation system. The methodology explains how data is obtained from learner interaction, how prediction models are developed and evaluated, and how model outputs are integrated into the application to support adaptive decision-making.</w:t>
+        <w:t>This section presents the methodology for implementing the artificial intelligence component of the proposed AI-powered personalised study planning and learning recommendation system. The methodology explains how external educational interaction datasets are curated and mapped into project features, how prediction models are developed and evaluated, and how model outputs are integrated into the application to support adaptive decision-making.</w:t>
       </w:r>
     </w:p>
     <w:p>
@@ -6912,21 +7903,7 @@
           <w:b/>
           <w:bCs/>
         </w:rPr>
-        <w:t>A</w:t>
-      </w:r>
-      <w:r>
-        <w:rPr>
-          <w:b/>
-          <w:bCs/>
-        </w:rPr>
-        <w:t>dherence prediction</w:t>
-      </w:r>
-      <w:r>
-        <w:rPr>
-          <w:b/>
-          <w:bCs/>
-        </w:rPr>
-        <w:t>:</w:t>
+        <w:t>Adherence prediction:</w:t>
       </w:r>
       <w:r>
         <w:t xml:space="preserve"> </w:t>
@@ -6960,21 +7937,7 @@
           <w:b/>
           <w:bCs/>
         </w:rPr>
-        <w:t>L</w:t>
-      </w:r>
-      <w:r>
-        <w:rPr>
-          <w:b/>
-          <w:bCs/>
-        </w:rPr>
-        <w:t>earning strategy recommendation</w:t>
-      </w:r>
-      <w:r>
-        <w:rPr>
-          <w:b/>
-          <w:bCs/>
-        </w:rPr>
-        <w:t>:</w:t>
+        <w:t>Learning strategy recommendation:</w:t>
       </w:r>
       <w:r>
         <w:t xml:space="preserve"> </w:t>
@@ -6983,7 +7946,15 @@
         <w:t>T</w:t>
       </w:r>
       <w:r>
-        <w:t>he system suggests suitable strategy categories based on learner profile and study behaviour signals.</w:t>
+        <w:t xml:space="preserve">he system suggests suitable strategy categories based on learner profile and study </w:t>
+      </w:r>
+      <w:proofErr w:type="spellStart"/>
+      <w:r>
+        <w:t>behaviour</w:t>
+      </w:r>
+      <w:proofErr w:type="spellEnd"/>
+      <w:r>
+        <w:t xml:space="preserve"> signals.</w:t>
       </w:r>
     </w:p>
     <w:p>
@@ -7001,19 +7972,15 @@
     </w:p>
     <w:p>
       <w:r>
-        <w:t xml:space="preserve">The proposed system adopts an interaction-based data collection approach where relevant learner data is captured during normal use of the platform. The collected data includes profile variables such as preferred learning style and available study time, planning variables such as planned study duration and course difficulty, and monitoring variables such as actual study duration, completion rate and self-reported focus score. </w:t>
-      </w:r>
-      <w:r>
-        <w:t>S</w:t>
-      </w:r>
-      <w:r>
-        <w:t>hort</w:t>
-      </w:r>
-      <w:r>
-        <w:t xml:space="preserve"> </w:t>
-      </w:r>
-      <w:r>
-        <w:t xml:space="preserve">term performance indicators are also captured to improve recommendation quality. </w:t>
+        <w:t xml:space="preserve">Because pilot users cannot generate sufficiently large and reliable behavioural data within the project timeline, this study adopts a secondary educational dataset strategy for model development. Data are sourced from established learning analytics repositories with longitudinal learner interaction events and performance outcomes, then mapped into the project canonical features such as planned workload, actual effort, completion rate, help-seeking </w:t>
+      </w:r>
+      <w:proofErr w:type="spellStart"/>
+      <w:r>
+        <w:t>behaviour</w:t>
+      </w:r>
+      <w:proofErr w:type="spellEnd"/>
+      <w:r>
+        <w:t xml:space="preserve"> and consistency indicators. This external dataset supports initial training and benchmarking, while live in-app logs are reserved for post-deployment domain adaptation and retraining.</w:t>
       </w:r>
     </w:p>
     <w:p>
@@ -7026,7 +7993,7 @@
     </w:p>
     <w:p>
       <w:r>
-        <w:t>A supervised learning dataset is constructed from recorded study activities. Each row represents a study session instance with input features and associated target values. Typical input features include planned minutes, actual minutes, completion rate, focus score, course difficulty, session frequency in recent days and deadline pressure indicators. Two target outputs are defined for modelling. The first target is adherence score</w:t>
+        <w:t>A supervised learning dataset is constructed from mapped external learner interaction records. Each row represents a learner-window or study-session instance with engineered input features and associated target values. Typical input features include workload and effort proxies, completion patterns, behavioural stability, support-seeking frequency and recent performance indicators. Two target outputs are defined for modelling. The first target is adherence score</w:t>
       </w:r>
       <w:r>
         <w:t xml:space="preserve"> which is</w:t>
@@ -7045,11 +8012,11 @@
     </w:p>
     <w:p>
       <w:r>
-        <w:t xml:space="preserve">Before model training, the dataset is prepared through preprocessing operations to ensure quality and consistency. Missing numerical values are handled with median imputation while categorical values are handled with mode imputation. Categorical variables are transformed into </w:t>
+        <w:t xml:space="preserve">Before model training, the dataset is prepared through preprocessing operations to ensure quality and consistency. Missing numerical values are handled with median imputation while </w:t>
       </w:r>
       <w:r>
         <w:lastRenderedPageBreak/>
-        <w:t>machine</w:t>
+        <w:t>categorical values are handled with mode imputation. Categorical variables are transformed into machine</w:t>
       </w:r>
       <w:r>
         <w:t xml:space="preserve"> </w:t>
@@ -7185,7 +8152,21 @@
         <w:rPr>
           <w:lang w:val="en-GB"/>
         </w:rPr>
-        <w:t xml:space="preserve">Borchers, C., Fleischer, H., Yaron, D. J., McLaren, B. M., Scheiter, K., Aleven, V., &amp; Schanze, S. (2025). Problem-Solving Strategies in Stoichiometry Across Two Intelligent Tutoring Systems: A Cross-National Study. </w:t>
+        <w:t xml:space="preserve">Borchers, C., Fleischer, H., Yaron, D. J., McLaren, B. M., Scheiter, K., </w:t>
+      </w:r>
+      <w:proofErr w:type="spellStart"/>
+      <w:r>
+        <w:rPr>
+          <w:lang w:val="en-GB"/>
+        </w:rPr>
+        <w:t>Aleven</w:t>
+      </w:r>
+      <w:proofErr w:type="spellEnd"/>
+      <w:r>
+        <w:rPr>
+          <w:lang w:val="en-GB"/>
+        </w:rPr>
+        <w:t xml:space="preserve">, V., &amp; Schanze, S. (2025). Problem-Solving Strategies in Stoichiometry Across Two Intelligent Tutoring Systems: A Cross-National Study. </w:t>
       </w:r>
       <w:r>
         <w:rPr>
@@ -7212,7 +8193,35 @@
         <w:rPr>
           <w:lang w:val="en-GB"/>
         </w:rPr>
-        <w:t xml:space="preserve">  Boroowa, A., &amp; Herodotou, C. (2022). Learning analytics in open and distance higher education: The case of the Open University UK. In </w:t>
+        <w:t xml:space="preserve">  </w:t>
+      </w:r>
+      <w:proofErr w:type="spellStart"/>
+      <w:r>
+        <w:rPr>
+          <w:lang w:val="en-GB"/>
+        </w:rPr>
+        <w:t>Boroowa</w:t>
+      </w:r>
+      <w:proofErr w:type="spellEnd"/>
+      <w:r>
+        <w:rPr>
+          <w:lang w:val="en-GB"/>
+        </w:rPr>
+        <w:t xml:space="preserve">, A., &amp; </w:t>
+      </w:r>
+      <w:proofErr w:type="spellStart"/>
+      <w:r>
+        <w:rPr>
+          <w:lang w:val="en-GB"/>
+        </w:rPr>
+        <w:t>Herodotou</w:t>
+      </w:r>
+      <w:proofErr w:type="spellEnd"/>
+      <w:r>
+        <w:rPr>
+          <w:lang w:val="en-GB"/>
+        </w:rPr>
+        <w:t xml:space="preserve">, C. (2022). Learning analytics in open and distance higher education: The case of the Open University UK. In </w:t>
       </w:r>
       <w:r>
         <w:rPr>
@@ -7260,19 +8269,27 @@
         <w:rPr>
           <w:lang w:val="en-GB"/>
         </w:rPr>
-        <w:t>, 27, 1–13.</w:t>
-      </w:r>
-    </w:p>
-    <w:p>
-      <w:pPr>
-        <w:rPr>
-          <w:lang w:val="en-GB"/>
-        </w:rPr>
-      </w:pPr>
-    </w:p>
-    <w:p>
-      <w:r>
-        <w:t xml:space="preserve">Broadbent, J. (2017). Comparing online and blended learners’ self-regulated learning strategies and academic performance. </w:t>
+        <w:t>, 27, 1â€“13.</w:t>
+      </w:r>
+    </w:p>
+    <w:p>
+      <w:pPr>
+        <w:rPr>
+          <w:lang w:val="en-GB"/>
+        </w:rPr>
+      </w:pPr>
+    </w:p>
+    <w:p>
+      <w:r>
+        <w:t xml:space="preserve">Broadbent, J. (2017). Comparing online and blended </w:t>
+      </w:r>
+      <w:proofErr w:type="spellStart"/>
+      <w:r>
+        <w:t>learnersâ</w:t>
+      </w:r>
+      <w:proofErr w:type="spellEnd"/>
+      <w:r>
+        <w:t xml:space="preserve">€™ self-regulated learning strategies and academic performance. </w:t>
       </w:r>
       <w:r>
         <w:rPr>
@@ -7282,7 +8299,7 @@
         <w:t>The Internet and Higher Education</w:t>
       </w:r>
       <w:r>
-        <w:t>, 33, 24–32.</w:t>
+        <w:t>, 33, 24â€“32.</w:t>
       </w:r>
     </w:p>
     <w:p>
@@ -7337,7 +8354,21 @@
         <w:rPr>
           <w:lang w:val="en-GB"/>
         </w:rPr>
-        <w:t xml:space="preserve">  Drachsler, H., &amp; Greller, W. (2016, April). Privacy and analytics: it's a DELICATE issue a checklist for trusted learning analytics. In </w:t>
+        <w:t xml:space="preserve">  </w:t>
+      </w:r>
+      <w:proofErr w:type="spellStart"/>
+      <w:r>
+        <w:rPr>
+          <w:lang w:val="en-GB"/>
+        </w:rPr>
+        <w:t>Drachsler</w:t>
+      </w:r>
+      <w:proofErr w:type="spellEnd"/>
+      <w:r>
+        <w:rPr>
+          <w:lang w:val="en-GB"/>
+        </w:rPr>
+        <w:t xml:space="preserve">, H., &amp; Greller, W. (2016, April). Privacy and analytics: it's a DELICATE issue a checklist for trusted learning analytics. In </w:t>
       </w:r>
       <w:r>
         <w:rPr>
@@ -7399,7 +8430,21 @@
         <w:rPr>
           <w:lang w:val="en-GB"/>
         </w:rPr>
-        <w:t xml:space="preserve">  Herodotou, C., Carr, J., Shrestha, S., Comfort, C., Bayer, V., Maguire, C., ... &amp; Fernandez, M. (2025, March). Prescriptive analytics motivating distance learning students to take remedial action: A case study of a student-facing dashboard. In </w:t>
+        <w:t xml:space="preserve">  </w:t>
+      </w:r>
+      <w:proofErr w:type="spellStart"/>
+      <w:r>
+        <w:rPr>
+          <w:lang w:val="en-GB"/>
+        </w:rPr>
+        <w:t>Herodotou</w:t>
+      </w:r>
+      <w:proofErr w:type="spellEnd"/>
+      <w:r>
+        <w:rPr>
+          <w:lang w:val="en-GB"/>
+        </w:rPr>
+        <w:t xml:space="preserve">, C., Carr, J., Shrestha, S., Comfort, C., Bayer, V., Maguire, C., ... &amp; Fernandez, M. (2025, March). Prescriptive analytics motivating distance learning students to take remedial action: A case study of a student-facing dashboard. In </w:t>
       </w:r>
       <w:r>
         <w:rPr>
@@ -7433,7 +8478,63 @@
         <w:rPr>
           <w:lang w:val="en-GB"/>
         </w:rPr>
-        <w:t xml:space="preserve">  Hlosta, M., Herodotou, C., Papathoma, T., Gillespie, A., &amp; Bergamin, P. (2022). Predictive learning analytics in online education: A deeper understanding through explaining algorithmic errors. </w:t>
+        <w:t xml:space="preserve">  </w:t>
+      </w:r>
+      <w:proofErr w:type="spellStart"/>
+      <w:r>
+        <w:rPr>
+          <w:lang w:val="en-GB"/>
+        </w:rPr>
+        <w:t>Hlosta</w:t>
+      </w:r>
+      <w:proofErr w:type="spellEnd"/>
+      <w:r>
+        <w:rPr>
+          <w:lang w:val="en-GB"/>
+        </w:rPr>
+        <w:t xml:space="preserve">, M., </w:t>
+      </w:r>
+      <w:proofErr w:type="spellStart"/>
+      <w:r>
+        <w:rPr>
+          <w:lang w:val="en-GB"/>
+        </w:rPr>
+        <w:t>Herodotou</w:t>
+      </w:r>
+      <w:proofErr w:type="spellEnd"/>
+      <w:r>
+        <w:rPr>
+          <w:lang w:val="en-GB"/>
+        </w:rPr>
+        <w:t xml:space="preserve">, C., </w:t>
+      </w:r>
+      <w:proofErr w:type="spellStart"/>
+      <w:r>
+        <w:rPr>
+          <w:lang w:val="en-GB"/>
+        </w:rPr>
+        <w:t>Papathoma</w:t>
+      </w:r>
+      <w:proofErr w:type="spellEnd"/>
+      <w:r>
+        <w:rPr>
+          <w:lang w:val="en-GB"/>
+        </w:rPr>
+        <w:t xml:space="preserve">, T., Gillespie, A., &amp; </w:t>
+      </w:r>
+      <w:proofErr w:type="spellStart"/>
+      <w:r>
+        <w:rPr>
+          <w:lang w:val="en-GB"/>
+        </w:rPr>
+        <w:t>Bergamin</w:t>
+      </w:r>
+      <w:proofErr w:type="spellEnd"/>
+      <w:r>
+        <w:rPr>
+          <w:lang w:val="en-GB"/>
+        </w:rPr>
+        <w:t xml:space="preserve">, P. (2022). Predictive learning analytics in online education: A deeper understanding through explaining algorithmic errors. </w:t>
       </w:r>
       <w:r>
         <w:rPr>
@@ -7467,7 +8568,35 @@
         <w:rPr>
           <w:lang w:val="en-GB"/>
         </w:rPr>
-        <w:t xml:space="preserve">  Huang, J., Cai, Y., Lv, Z., Huang, Y., &amp; Zheng, X. L. (2024). Toward self-regulated learning: effects of different types of data-driven feedback on pupils’ mathematics word problem-solving performance. </w:t>
+        <w:t xml:space="preserve">  Huang, J., Cai, Y., </w:t>
+      </w:r>
+      <w:proofErr w:type="spellStart"/>
+      <w:r>
+        <w:rPr>
+          <w:lang w:val="en-GB"/>
+        </w:rPr>
+        <w:t>Lv</w:t>
+      </w:r>
+      <w:proofErr w:type="spellEnd"/>
+      <w:r>
+        <w:rPr>
+          <w:lang w:val="en-GB"/>
+        </w:rPr>
+        <w:t xml:space="preserve">, Z., Huang, Y., &amp; Zheng, X. L. (2024). Toward self-regulated learning: effects of different types of data-driven feedback on </w:t>
+      </w:r>
+      <w:proofErr w:type="spellStart"/>
+      <w:r>
+        <w:rPr>
+          <w:lang w:val="en-GB"/>
+        </w:rPr>
+        <w:t>pupilsâ</w:t>
+      </w:r>
+      <w:proofErr w:type="spellEnd"/>
+      <w:r>
+        <w:rPr>
+          <w:lang w:val="en-GB"/>
+        </w:rPr>
+        <w:t xml:space="preserve">€™ mathematics word problem-solving performance. </w:t>
       </w:r>
       <w:r>
         <w:rPr>
@@ -7501,7 +8630,21 @@
         <w:rPr>
           <w:lang w:val="en-GB"/>
         </w:rPr>
-        <w:t xml:space="preserve">  Ifenthaler, D., &amp; Yau, J. Y. K. (2020). Utilising learning analytics to support study success in higher education: a systematic review. </w:t>
+        <w:t xml:space="preserve">  </w:t>
+      </w:r>
+      <w:proofErr w:type="spellStart"/>
+      <w:r>
+        <w:rPr>
+          <w:lang w:val="en-GB"/>
+        </w:rPr>
+        <w:t>Ifenthaler</w:t>
+      </w:r>
+      <w:proofErr w:type="spellEnd"/>
+      <w:r>
+        <w:rPr>
+          <w:lang w:val="en-GB"/>
+        </w:rPr>
+        <w:t xml:space="preserve">, D., &amp; Yau, J. Y. K. (2020). Utilising learning analytics to support study success in higher education: a systematic review. </w:t>
       </w:r>
       <w:r>
         <w:rPr>
@@ -7565,186 +8708,143 @@
         <w:jc w:val="both"/>
       </w:pPr>
       <w:r>
-        <w:t>Kim, J., Merrill, K., Xu, K., &amp; Sellnow, D. D. (2020). My teacher is a machine: Understanding students’ perceptions of AI teaching assistants in online education. </w:t>
+        <w:t xml:space="preserve">Kim, J., Merrill, K., Xu, K., &amp; Sellnow, D. D. (2020). My teacher is a machine: Understanding </w:t>
+      </w:r>
+      <w:proofErr w:type="spellStart"/>
+      <w:r>
+        <w:t>studentsâ</w:t>
+      </w:r>
+      <w:proofErr w:type="spellEnd"/>
+      <w:r>
+        <w:t xml:space="preserve">€™ perceptions of AI teaching assistants in online </w:t>
+      </w:r>
+      <w:proofErr w:type="spellStart"/>
+      <w:r>
+        <w:t>education.Â</w:t>
+      </w:r>
+      <w:proofErr w:type="spellEnd"/>
+      <w:r>
+        <w:t> </w:t>
       </w:r>
       <w:r>
         <w:rPr>
           <w:i/>
           <w:iCs/>
         </w:rPr>
-        <w:t>International Journal of Human–Computer Interaction</w:t>
-      </w:r>
-      <w:r>
-        <w:t>, </w:t>
-      </w:r>
+        <w:t xml:space="preserve">International Journal of </w:t>
+      </w:r>
+      <w:proofErr w:type="spellStart"/>
       <w:r>
         <w:rPr>
           <w:i/>
           <w:iCs/>
         </w:rPr>
-        <w:t>36</w:t>
-      </w:r>
-      <w:r>
-        <w:t>(20), 1902-1911.</w:t>
-      </w:r>
-    </w:p>
-    <w:p>
-      <w:pPr>
-        <w:rPr>
-          <w:lang w:val="en-GB"/>
-        </w:rPr>
-      </w:pPr>
-    </w:p>
-    <w:p>
-      <w:pPr>
-        <w:rPr>
-          <w:lang w:val="en-GB"/>
-        </w:rPr>
-      </w:pPr>
-      <w:r>
-        <w:rPr>
-          <w:lang w:val="en-GB"/>
-        </w:rPr>
-        <w:t xml:space="preserve">  </w:t>
-      </w:r>
-      <w:r>
-        <w:t>Lai, C. H., Jong, B. S., Hsia, Y. T., &amp; Lin, T. W. (2020). Using reminder tools to increase learning motivation: A comparison of mobile devices, email and e-learning platforms.</w:t>
-      </w:r>
-    </w:p>
-    <w:p>
-      <w:pPr>
-        <w:ind w:firstLine="0"/>
-        <w:rPr>
-          <w:lang w:val="en-GB"/>
-        </w:rPr>
-      </w:pPr>
-    </w:p>
-    <w:p>
-      <w:pPr>
-        <w:rPr>
-          <w:lang w:val="en-GB"/>
-        </w:rPr>
-      </w:pPr>
-      <w:r>
-        <w:rPr>
-          <w:lang w:val="en-GB"/>
-        </w:rPr>
-        <w:t xml:space="preserve">  Lim, L. A., Gentili, S., Pardo, A., Kovanović, V., Whitelock-Wainwright, A., Gašević, D., &amp; Dawson, S. (2021). What changes, and for whom? A study of the impact of learning analytics-based process feedback in a large course. </w:t>
-      </w:r>
+        <w:t>Humanâ</w:t>
+      </w:r>
+      <w:proofErr w:type="spellEnd"/>
       <w:r>
         <w:rPr>
           <w:i/>
           <w:iCs/>
-          <w:lang w:val="en-GB"/>
-        </w:rPr>
-        <w:t>Learning and Instruction</w:t>
-      </w:r>
-      <w:r>
-        <w:rPr>
-          <w:lang w:val="en-GB"/>
-        </w:rPr>
-        <w:t>, 72, 101202.</w:t>
-      </w:r>
-    </w:p>
-    <w:p>
-      <w:pPr>
-        <w:rPr>
-          <w:lang w:val="en-GB"/>
-        </w:rPr>
-      </w:pPr>
-    </w:p>
-    <w:p>
-      <w:pPr>
-        <w:rPr>
-          <w:lang w:val="en-GB"/>
-        </w:rPr>
-      </w:pPr>
-      <w:r>
-        <w:rPr>
-          <w:lang w:val="en-GB"/>
-        </w:rPr>
-        <w:t xml:space="preserve">  Luckin, R., &amp; Holmes, W. (2016). </w:t>
-      </w:r>
+        </w:rPr>
+        <w:t xml:space="preserve">€“Computer </w:t>
+      </w:r>
+      <w:proofErr w:type="spellStart"/>
       <w:r>
         <w:rPr>
           <w:i/>
           <w:iCs/>
-          <w:lang w:val="en-GB"/>
-        </w:rPr>
-        <w:t>Intelligence unleashed: An argument for AI in education</w:t>
-      </w:r>
-      <w:r>
-        <w:rPr>
-          <w:lang w:val="en-GB"/>
-        </w:rPr>
-        <w:t xml:space="preserve">. </w:t>
-      </w:r>
-    </w:p>
-    <w:p>
-      <w:pPr>
-        <w:rPr>
-          <w:lang w:val="en-GB"/>
-        </w:rPr>
-      </w:pPr>
-    </w:p>
-    <w:p>
-      <w:pPr>
-        <w:rPr>
-          <w:lang w:val="en-GB"/>
-        </w:rPr>
-      </w:pPr>
-      <w:r>
-        <w:rPr>
-          <w:lang w:val="en-GB"/>
-        </w:rPr>
-        <w:t xml:space="preserve">  Matcha, W., Gašević, D., Uzir, N. A. A., Jovanović, J., &amp; Pardo, A. (2019, March). Analytics of learning strategies: Associations with academic performance and feedback. In </w:t>
+        </w:rPr>
+        <w:t>Interaction</w:t>
+      </w:r>
+      <w:r>
+        <w:t>,Â</w:t>
+      </w:r>
+      <w:proofErr w:type="spellEnd"/>
+      <w:r>
+        <w:t> </w:t>
       </w:r>
       <w:r>
         <w:rPr>
           <w:i/>
           <w:iCs/>
-          <w:lang w:val="en-GB"/>
-        </w:rPr>
-        <w:t>Proceedings of the 9th international conference on learning analytics &amp; knowledge</w:t>
-      </w:r>
-      <w:r>
-        <w:rPr>
-          <w:lang w:val="en-GB"/>
-        </w:rPr>
-        <w:t xml:space="preserve"> (pp. 461-470).</w:t>
-      </w:r>
-    </w:p>
-    <w:p>
-      <w:pPr>
-        <w:rPr>
-          <w:lang w:val="en-GB"/>
-        </w:rPr>
-      </w:pPr>
-    </w:p>
-    <w:p>
-      <w:r>
-        <w:lastRenderedPageBreak/>
-        <w:t>Miao, F., &amp; Holmes, W. (2021). Artificial intelligence and education: Guidance for policy-makers.</w:t>
-      </w:r>
-    </w:p>
-    <w:p>
-      <w:pPr>
-        <w:rPr>
-          <w:lang w:val="en-GB"/>
-        </w:rPr>
-      </w:pPr>
-    </w:p>
-    <w:p>
-      <w:pPr>
-        <w:rPr>
-          <w:lang w:val="en-GB"/>
-        </w:rPr>
-      </w:pPr>
-      <w:r>
-        <w:rPr>
-          <w:lang w:val="en-GB"/>
-        </w:rPr>
-        <w:t xml:space="preserve">  Molenaar, I., de Mooij, S., Azevedo, R., Bannert, M., Järvelä, S., &amp; Gašević, D. (2023). Measuring self-regulated learning and the role of AI: Five years of research using multimodal multichannel data. </w:t>
+        </w:rPr>
+        <w:t>36</w:t>
+      </w:r>
+      <w:r>
+        <w:t>(20), 1902-1911.</w:t>
+      </w:r>
+    </w:p>
+    <w:p>
+      <w:pPr>
+        <w:rPr>
+          <w:lang w:val="en-GB"/>
+        </w:rPr>
+      </w:pPr>
+    </w:p>
+    <w:p>
+      <w:pPr>
+        <w:rPr>
+          <w:lang w:val="en-GB"/>
+        </w:rPr>
+      </w:pPr>
+      <w:r>
+        <w:rPr>
+          <w:lang w:val="en-GB"/>
+        </w:rPr>
+        <w:t xml:space="preserve">  </w:t>
+      </w:r>
+      <w:r>
+        <w:t>Lai, C. H., Jong, B. S., Hsia, Y. T., &amp; Lin, T. W. (2020). Using reminder tools to increase learning motivation: A comparison of mobile devices, email and e-learning platforms.</w:t>
+      </w:r>
+    </w:p>
+    <w:p>
+      <w:pPr>
+        <w:ind w:firstLine="0"/>
+        <w:rPr>
+          <w:lang w:val="en-GB"/>
+        </w:rPr>
+      </w:pPr>
+    </w:p>
+    <w:p>
+      <w:pPr>
+        <w:rPr>
+          <w:lang w:val="en-GB"/>
+        </w:rPr>
+      </w:pPr>
+      <w:r>
+        <w:rPr>
+          <w:lang w:val="en-GB"/>
+        </w:rPr>
+        <w:t xml:space="preserve">  Lim, L. A., Gentili, S., Pardo, A., </w:t>
+      </w:r>
+      <w:proofErr w:type="spellStart"/>
+      <w:r>
+        <w:rPr>
+          <w:lang w:val="en-GB"/>
+        </w:rPr>
+        <w:t>KovanoviÄ</w:t>
+      </w:r>
+      <w:proofErr w:type="spellEnd"/>
+      <w:r>
+        <w:rPr>
+          <w:lang w:val="en-GB"/>
+        </w:rPr>
+        <w:t xml:space="preserve">‡, V., Whitelock-Wainwright, A., </w:t>
+      </w:r>
+      <w:proofErr w:type="spellStart"/>
+      <w:r>
+        <w:rPr>
+          <w:lang w:val="en-GB"/>
+        </w:rPr>
+        <w:t>GaÅ¡eviÄ</w:t>
+      </w:r>
+      <w:proofErr w:type="spellEnd"/>
+      <w:r>
+        <w:rPr>
+          <w:lang w:val="en-GB"/>
+        </w:rPr>
+        <w:t xml:space="preserve">‡, D., &amp; Dawson, S. (2021). What changes, and for whom? A study of the impact of learning analytics-based process feedback in a large course. </w:t>
       </w:r>
       <w:r>
         <w:rPr>
@@ -7752,33 +8852,33 @@
           <w:iCs/>
           <w:lang w:val="en-GB"/>
         </w:rPr>
-        <w:t>Computers in Human Behavior</w:t>
-      </w:r>
-      <w:r>
-        <w:rPr>
-          <w:lang w:val="en-GB"/>
-        </w:rPr>
-        <w:t>, 139, 107540.</w:t>
-      </w:r>
-    </w:p>
-    <w:p>
-      <w:pPr>
-        <w:rPr>
-          <w:lang w:val="en-GB"/>
-        </w:rPr>
-      </w:pPr>
-    </w:p>
-    <w:p>
-      <w:pPr>
-        <w:rPr>
-          <w:lang w:val="en-GB"/>
-        </w:rPr>
-      </w:pPr>
-      <w:r>
-        <w:rPr>
-          <w:lang w:val="en-GB"/>
-        </w:rPr>
-        <w:t xml:space="preserve">  Nagashima, T., Tseng, S., Ling, E., Bartel, A. N., Vest, N. A., Silla, E. M., ... &amp; Aleven, V. (2022, June). Students’ self-regulated use of diagrams in a choice-based Intelligent Tutoring System. In </w:t>
+        <w:t>Learning and Instruction</w:t>
+      </w:r>
+      <w:r>
+        <w:rPr>
+          <w:lang w:val="en-GB"/>
+        </w:rPr>
+        <w:t>, 72, 101202.</w:t>
+      </w:r>
+    </w:p>
+    <w:p>
+      <w:pPr>
+        <w:rPr>
+          <w:lang w:val="en-GB"/>
+        </w:rPr>
+      </w:pPr>
+    </w:p>
+    <w:p>
+      <w:pPr>
+        <w:rPr>
+          <w:lang w:val="en-GB"/>
+        </w:rPr>
+      </w:pPr>
+      <w:r>
+        <w:rPr>
+          <w:lang w:val="en-GB"/>
+        </w:rPr>
+        <w:t xml:space="preserve">  Luckin, R., &amp; Holmes, W. (2016). </w:t>
       </w:r>
       <w:r>
         <w:rPr>
@@ -7786,33 +8886,75 @@
           <w:iCs/>
           <w:lang w:val="en-GB"/>
         </w:rPr>
-        <w:t>Proceedings of the 16th International Conference of the Learning Sciences, ICLS 2022</w:t>
-      </w:r>
-      <w:r>
-        <w:rPr>
-          <w:lang w:val="en-GB"/>
-        </w:rPr>
-        <w:t>.</w:t>
-      </w:r>
-    </w:p>
-    <w:p>
-      <w:pPr>
-        <w:rPr>
-          <w:lang w:val="en-GB"/>
-        </w:rPr>
-      </w:pPr>
-    </w:p>
-    <w:p>
-      <w:pPr>
-        <w:rPr>
-          <w:lang w:val="en-GB"/>
-        </w:rPr>
-      </w:pPr>
-      <w:r>
-        <w:rPr>
-          <w:lang w:val="en-GB"/>
-        </w:rPr>
-        <w:t xml:space="preserve">  Nobbe, L., Breitwieser, J., Biedermann, D., &amp; Brod, G. (2024). Smartphone-based study reminders can be a double-edged sword. </w:t>
+        <w:t>Intelligence unleashed: An argument for AI in education</w:t>
+      </w:r>
+      <w:r>
+        <w:rPr>
+          <w:lang w:val="en-GB"/>
+        </w:rPr>
+        <w:t xml:space="preserve">. </w:t>
+      </w:r>
+    </w:p>
+    <w:p>
+      <w:pPr>
+        <w:rPr>
+          <w:lang w:val="en-GB"/>
+        </w:rPr>
+      </w:pPr>
+    </w:p>
+    <w:p>
+      <w:pPr>
+        <w:rPr>
+          <w:lang w:val="en-GB"/>
+        </w:rPr>
+      </w:pPr>
+      <w:r>
+        <w:rPr>
+          <w:lang w:val="en-GB"/>
+        </w:rPr>
+        <w:t xml:space="preserve">  Matcha, W., </w:t>
+      </w:r>
+      <w:proofErr w:type="spellStart"/>
+      <w:r>
+        <w:rPr>
+          <w:lang w:val="en-GB"/>
+        </w:rPr>
+        <w:t>GaÅ¡eviÄ</w:t>
+      </w:r>
+      <w:proofErr w:type="spellEnd"/>
+      <w:r>
+        <w:rPr>
+          <w:lang w:val="en-GB"/>
+        </w:rPr>
+        <w:t xml:space="preserve">‡, D., </w:t>
+      </w:r>
+      <w:proofErr w:type="spellStart"/>
+      <w:r>
+        <w:rPr>
+          <w:lang w:val="en-GB"/>
+        </w:rPr>
+        <w:t>Uzir</w:t>
+      </w:r>
+      <w:proofErr w:type="spellEnd"/>
+      <w:r>
+        <w:rPr>
+          <w:lang w:val="en-GB"/>
+        </w:rPr>
+        <w:t xml:space="preserve">, N. A. A., </w:t>
+      </w:r>
+      <w:proofErr w:type="spellStart"/>
+      <w:r>
+        <w:rPr>
+          <w:lang w:val="en-GB"/>
+        </w:rPr>
+        <w:t>JovanoviÄ</w:t>
+      </w:r>
+      <w:proofErr w:type="spellEnd"/>
+      <w:r>
+        <w:rPr>
+          <w:lang w:val="en-GB"/>
+        </w:rPr>
+        <w:t xml:space="preserve">‡, J., &amp; Pardo, A. (2019, March). Analytics of learning strategies: Associations with academic performance and feedback. In </w:t>
       </w:r>
       <w:r>
         <w:rPr>
@@ -7820,33 +8962,87 @@
           <w:iCs/>
           <w:lang w:val="en-GB"/>
         </w:rPr>
-        <w:t>npj Science of Learning</w:t>
-      </w:r>
-      <w:r>
-        <w:rPr>
-          <w:lang w:val="en-GB"/>
-        </w:rPr>
-        <w:t>, 9(1), 40.</w:t>
-      </w:r>
-    </w:p>
-    <w:p>
-      <w:pPr>
-        <w:rPr>
-          <w:lang w:val="en-GB"/>
-        </w:rPr>
-      </w:pPr>
-    </w:p>
-    <w:p>
-      <w:pPr>
-        <w:rPr>
-          <w:lang w:val="en-GB"/>
-        </w:rPr>
-      </w:pPr>
-      <w:r>
-        <w:rPr>
-          <w:lang w:val="en-GB"/>
-        </w:rPr>
-        <w:t xml:space="preserve">  Oulasvirta, A., Rattenbury, T., Ma, L., &amp; Raita, E. (2012). Habits make smartphone use more pervasive. </w:t>
+        <w:t>Proceedings of the 9th international conference on learning analytics &amp; knowledge</w:t>
+      </w:r>
+      <w:r>
+        <w:rPr>
+          <w:lang w:val="en-GB"/>
+        </w:rPr>
+        <w:t xml:space="preserve"> (pp. 461-470).</w:t>
+      </w:r>
+    </w:p>
+    <w:p>
+      <w:pPr>
+        <w:rPr>
+          <w:lang w:val="en-GB"/>
+        </w:rPr>
+      </w:pPr>
+    </w:p>
+    <w:p>
+      <w:r>
+        <w:t>Miao, F., &amp; Holmes, W. (2021). Artificial intelligence and education: Guidance for policy-makers.</w:t>
+      </w:r>
+    </w:p>
+    <w:p>
+      <w:pPr>
+        <w:rPr>
+          <w:lang w:val="en-GB"/>
+        </w:rPr>
+      </w:pPr>
+    </w:p>
+    <w:p>
+      <w:pPr>
+        <w:rPr>
+          <w:lang w:val="en-GB"/>
+        </w:rPr>
+      </w:pPr>
+      <w:r>
+        <w:rPr>
+          <w:lang w:val="en-GB"/>
+        </w:rPr>
+        <w:t xml:space="preserve">  Molenaar, I., de </w:t>
+      </w:r>
+      <w:proofErr w:type="spellStart"/>
+      <w:r>
+        <w:rPr>
+          <w:lang w:val="en-GB"/>
+        </w:rPr>
+        <w:t>Mooij</w:t>
+      </w:r>
+      <w:proofErr w:type="spellEnd"/>
+      <w:r>
+        <w:rPr>
+          <w:lang w:val="en-GB"/>
+        </w:rPr>
+        <w:t xml:space="preserve">, S., Azevedo, R., Bannert, M., </w:t>
+      </w:r>
+      <w:proofErr w:type="spellStart"/>
+      <w:r>
+        <w:rPr>
+          <w:lang w:val="en-GB"/>
+        </w:rPr>
+        <w:t>JÃ¤rvelÃ</w:t>
+      </w:r>
+      <w:proofErr w:type="spellEnd"/>
+      <w:r>
+        <w:rPr>
+          <w:lang w:val="en-GB"/>
+        </w:rPr>
+        <w:t xml:space="preserve">¤, S., &amp; </w:t>
+      </w:r>
+      <w:proofErr w:type="spellStart"/>
+      <w:r>
+        <w:rPr>
+          <w:lang w:val="en-GB"/>
+        </w:rPr>
+        <w:t>GaÅ¡eviÄ</w:t>
+      </w:r>
+      <w:proofErr w:type="spellEnd"/>
+      <w:r>
+        <w:rPr>
+          <w:lang w:val="en-GB"/>
+        </w:rPr>
+        <w:t xml:space="preserve">‡, D. (2023). Measuring self-regulated learning and the role of AI: Five years of research using multimodal multichannel data. </w:t>
       </w:r>
       <w:r>
         <w:rPr>
@@ -7854,40 +9050,204 @@
           <w:iCs/>
           <w:lang w:val="en-GB"/>
         </w:rPr>
-        <w:t>Personal and Ubiquitous Computing</w:t>
-      </w:r>
-      <w:r>
-        <w:rPr>
-          <w:lang w:val="en-GB"/>
-        </w:rPr>
-        <w:t>, 16(1), 105–114.</w:t>
-      </w:r>
-    </w:p>
-    <w:p>
-      <w:pPr>
-        <w:rPr>
-          <w:lang w:val="en-GB"/>
-        </w:rPr>
-      </w:pPr>
-    </w:p>
-    <w:p>
-      <w:pPr>
-        <w:rPr>
-          <w:lang w:val="en-GB"/>
-        </w:rPr>
-      </w:pPr>
-      <w:r>
-        <w:rPr>
-          <w:lang w:val="en-GB"/>
-        </w:rPr>
-        <w:t xml:space="preserve">  Ouyang, Z. (2025). Self-regulated learning and engagement as serial mediators between AI-driven adaptive learning platform characteristics and educational quality: a psychological mechanism analysis. </w:t>
-      </w:r>
+        <w:t xml:space="preserve">Computers in Human </w:t>
+      </w:r>
+      <w:proofErr w:type="spellStart"/>
       <w:r>
         <w:rPr>
           <w:i/>
           <w:iCs/>
           <w:lang w:val="en-GB"/>
         </w:rPr>
+        <w:t>Behavior</w:t>
+      </w:r>
+      <w:proofErr w:type="spellEnd"/>
+      <w:r>
+        <w:rPr>
+          <w:lang w:val="en-GB"/>
+        </w:rPr>
+        <w:t>, 139, 107540.</w:t>
+      </w:r>
+    </w:p>
+    <w:p>
+      <w:pPr>
+        <w:rPr>
+          <w:lang w:val="en-GB"/>
+        </w:rPr>
+      </w:pPr>
+    </w:p>
+    <w:p>
+      <w:pPr>
+        <w:rPr>
+          <w:lang w:val="en-GB"/>
+        </w:rPr>
+      </w:pPr>
+      <w:r>
+        <w:rPr>
+          <w:lang w:val="en-GB"/>
+        </w:rPr>
+        <w:t xml:space="preserve">  Nagashima, T., Tseng, S., Ling, E., Bartel, A. N., Vest, N. A., Silla, E. M., ... &amp; </w:t>
+      </w:r>
+      <w:proofErr w:type="spellStart"/>
+      <w:r>
+        <w:rPr>
+          <w:lang w:val="en-GB"/>
+        </w:rPr>
+        <w:t>Aleven</w:t>
+      </w:r>
+      <w:proofErr w:type="spellEnd"/>
+      <w:r>
+        <w:rPr>
+          <w:lang w:val="en-GB"/>
+        </w:rPr>
+        <w:t xml:space="preserve">, V. (2022, June). </w:t>
+      </w:r>
+      <w:proofErr w:type="spellStart"/>
+      <w:r>
+        <w:rPr>
+          <w:lang w:val="en-GB"/>
+        </w:rPr>
+        <w:t>Studentsâ</w:t>
+      </w:r>
+      <w:proofErr w:type="spellEnd"/>
+      <w:r>
+        <w:rPr>
+          <w:lang w:val="en-GB"/>
+        </w:rPr>
+        <w:t xml:space="preserve">€™ self-regulated use of diagrams in a choice-based Intelligent Tutoring System. In </w:t>
+      </w:r>
+      <w:r>
+        <w:rPr>
+          <w:i/>
+          <w:iCs/>
+          <w:lang w:val="en-GB"/>
+        </w:rPr>
+        <w:t>Proceedings of the 16th International Conference of the Learning Sciences, ICLS 2022</w:t>
+      </w:r>
+      <w:r>
+        <w:rPr>
+          <w:lang w:val="en-GB"/>
+        </w:rPr>
+        <w:t>.</w:t>
+      </w:r>
+    </w:p>
+    <w:p>
+      <w:pPr>
+        <w:rPr>
+          <w:lang w:val="en-GB"/>
+        </w:rPr>
+      </w:pPr>
+    </w:p>
+    <w:p>
+      <w:pPr>
+        <w:rPr>
+          <w:lang w:val="en-GB"/>
+        </w:rPr>
+      </w:pPr>
+      <w:r>
+        <w:rPr>
+          <w:lang w:val="en-GB"/>
+        </w:rPr>
+        <w:t xml:space="preserve">  Nobbe, L., Breitwieser, J., Biedermann, D., &amp; Brod, G. (2024). Smartphone-based study reminders can be a double-edged sword. </w:t>
+      </w:r>
+      <w:proofErr w:type="spellStart"/>
+      <w:r>
+        <w:rPr>
+          <w:i/>
+          <w:iCs/>
+          <w:lang w:val="en-GB"/>
+        </w:rPr>
+        <w:t>npj</w:t>
+      </w:r>
+      <w:proofErr w:type="spellEnd"/>
+      <w:r>
+        <w:rPr>
+          <w:i/>
+          <w:iCs/>
+          <w:lang w:val="en-GB"/>
+        </w:rPr>
+        <w:t xml:space="preserve"> Science of Learning</w:t>
+      </w:r>
+      <w:r>
+        <w:rPr>
+          <w:lang w:val="en-GB"/>
+        </w:rPr>
+        <w:t>, 9(1), 40.</w:t>
+      </w:r>
+    </w:p>
+    <w:p>
+      <w:pPr>
+        <w:rPr>
+          <w:lang w:val="en-GB"/>
+        </w:rPr>
+      </w:pPr>
+    </w:p>
+    <w:p>
+      <w:pPr>
+        <w:rPr>
+          <w:lang w:val="en-GB"/>
+        </w:rPr>
+      </w:pPr>
+      <w:r>
+        <w:rPr>
+          <w:lang w:val="en-GB"/>
+        </w:rPr>
+        <w:t xml:space="preserve">  </w:t>
+      </w:r>
+      <w:proofErr w:type="spellStart"/>
+      <w:r>
+        <w:rPr>
+          <w:lang w:val="en-GB"/>
+        </w:rPr>
+        <w:t>Oulasvirta</w:t>
+      </w:r>
+      <w:proofErr w:type="spellEnd"/>
+      <w:r>
+        <w:rPr>
+          <w:lang w:val="en-GB"/>
+        </w:rPr>
+        <w:t xml:space="preserve">, A., Rattenbury, T., Ma, L., &amp; Raita, E. (2012). Habits make smartphone use more pervasive. </w:t>
+      </w:r>
+      <w:r>
+        <w:rPr>
+          <w:i/>
+          <w:iCs/>
+          <w:lang w:val="en-GB"/>
+        </w:rPr>
+        <w:t>Personal and Ubiquitous Computing</w:t>
+      </w:r>
+      <w:r>
+        <w:rPr>
+          <w:lang w:val="en-GB"/>
+        </w:rPr>
+        <w:t>, 16(1), 105â€“114.</w:t>
+      </w:r>
+    </w:p>
+    <w:p>
+      <w:pPr>
+        <w:rPr>
+          <w:lang w:val="en-GB"/>
+        </w:rPr>
+      </w:pPr>
+    </w:p>
+    <w:p>
+      <w:pPr>
+        <w:rPr>
+          <w:lang w:val="en-GB"/>
+        </w:rPr>
+      </w:pPr>
+      <w:r>
+        <w:rPr>
+          <w:lang w:val="en-GB"/>
+        </w:rPr>
+        <w:t xml:space="preserve">  Ouyang, Z. (2025). Self-regulated learning and engagement as serial mediators between AI-driven adaptive learning platform characteristics and educational quality: a psychological mechanism analysis. </w:t>
+      </w:r>
+      <w:r>
+        <w:rPr>
+          <w:i/>
+          <w:iCs/>
+          <w:lang w:val="en-GB"/>
+        </w:rPr>
         <w:t>Frontiers in Psychology</w:t>
       </w:r>
       <w:r>
@@ -7954,27 +9314,55 @@
         <w:t>Research in Science Education</w:t>
       </w:r>
       <w:r>
-        <w:t>, 36(1–2), 111–139.</w:t>
-      </w:r>
-    </w:p>
-    <w:p>
-      <w:pPr>
-        <w:rPr>
-          <w:lang w:val="en-GB"/>
-        </w:rPr>
-      </w:pPr>
-    </w:p>
-    <w:p>
-      <w:pPr>
-        <w:rPr>
-          <w:lang w:val="en-GB"/>
-        </w:rPr>
-      </w:pPr>
-      <w:r>
-        <w:rPr>
-          <w:lang w:val="en-GB"/>
-        </w:rPr>
-        <w:t xml:space="preserve">  Sedrakyan, G., Malmberg, J., Verbert, K., Järvelä, S., &amp; Kirschner, P. A. (2020). Linking learning behavior analytics and learning science concepts: Designing a learning analytics dashboard for feedback to support learning regulation. </w:t>
+        <w:t>, 36(1â€“2), 111â€“139.</w:t>
+      </w:r>
+    </w:p>
+    <w:p>
+      <w:pPr>
+        <w:rPr>
+          <w:lang w:val="en-GB"/>
+        </w:rPr>
+      </w:pPr>
+    </w:p>
+    <w:p>
+      <w:pPr>
+        <w:rPr>
+          <w:lang w:val="en-GB"/>
+        </w:rPr>
+      </w:pPr>
+      <w:r>
+        <w:rPr>
+          <w:lang w:val="en-GB"/>
+        </w:rPr>
+        <w:t xml:space="preserve">  Sedrakyan, G., Malmberg, J., Verbert, K., </w:t>
+      </w:r>
+      <w:proofErr w:type="spellStart"/>
+      <w:r>
+        <w:rPr>
+          <w:lang w:val="en-GB"/>
+        </w:rPr>
+        <w:t>JÃ¤rvelÃ</w:t>
+      </w:r>
+      <w:proofErr w:type="spellEnd"/>
+      <w:r>
+        <w:rPr>
+          <w:lang w:val="en-GB"/>
+        </w:rPr>
+        <w:t xml:space="preserve">¤, S., &amp; Kirschner, P. A. (2020). Linking learning </w:t>
+      </w:r>
+      <w:proofErr w:type="spellStart"/>
+      <w:r>
+        <w:rPr>
+          <w:lang w:val="en-GB"/>
+        </w:rPr>
+        <w:t>behavior</w:t>
+      </w:r>
+      <w:proofErr w:type="spellEnd"/>
+      <w:r>
+        <w:rPr>
+          <w:lang w:val="en-GB"/>
+        </w:rPr>
+        <w:t xml:space="preserve"> analytics and learning science concepts: Designing a learning analytics dashboard for feedback to support learning regulation. </w:t>
       </w:r>
       <w:r>
         <w:rPr>
@@ -7982,67 +9370,99 @@
           <w:iCs/>
           <w:lang w:val="en-GB"/>
         </w:rPr>
-        <w:t>Computers in Human Behavior</w:t>
-      </w:r>
-      <w:r>
-        <w:rPr>
-          <w:lang w:val="en-GB"/>
-        </w:rPr>
-        <w:t>, 107, 105512.</w:t>
-      </w:r>
-    </w:p>
-    <w:p>
-      <w:pPr>
-        <w:rPr>
-          <w:lang w:val="en-GB"/>
-        </w:rPr>
-      </w:pPr>
-    </w:p>
-    <w:p>
-      <w:pPr>
-        <w:rPr>
-          <w:lang w:val="en-GB"/>
-        </w:rPr>
-      </w:pPr>
-      <w:r>
-        <w:rPr>
-          <w:lang w:val="en-GB"/>
-        </w:rPr>
-        <w:t xml:space="preserve">  Sousa, E. B. D., Alexandre, B., Ferreira Mello, R., Pontual Falcão, T., Vesin, B., &amp; Gašević, D. (2021). Applications of learning analytics in high schools: A systematic literature review. </w:t>
-      </w:r>
+        <w:t xml:space="preserve">Computers in Human </w:t>
+      </w:r>
+      <w:proofErr w:type="spellStart"/>
       <w:r>
         <w:rPr>
           <w:i/>
           <w:iCs/>
           <w:lang w:val="en-GB"/>
         </w:rPr>
-        <w:t>Frontiers in Artificial Intelligence</w:t>
-      </w:r>
-      <w:r>
-        <w:rPr>
-          <w:lang w:val="en-GB"/>
-        </w:rPr>
-        <w:t>, 4, 737891.</w:t>
-      </w:r>
-    </w:p>
-    <w:p>
-      <w:pPr>
-        <w:rPr>
-          <w:lang w:val="en-GB"/>
-        </w:rPr>
-      </w:pPr>
-    </w:p>
-    <w:p>
-      <w:pPr>
-        <w:rPr>
-          <w:lang w:val="en-GB"/>
-        </w:rPr>
-      </w:pPr>
-      <w:r>
-        <w:rPr>
-          <w:lang w:val="en-GB"/>
-        </w:rPr>
-        <w:t xml:space="preserve">  Stinar, F., Lee, H., Belitz, C., Nasiar, N., Fancsali, S. E., Ritter, S., ... &amp; Bosch, N. (2025). Fairness of Bayesian Knowledge Tracing for Math Learners of Different Reading Ability. </w:t>
+        <w:t>Behavior</w:t>
+      </w:r>
+      <w:proofErr w:type="spellEnd"/>
+      <w:r>
+        <w:rPr>
+          <w:lang w:val="en-GB"/>
+        </w:rPr>
+        <w:t>, 107, 105512.</w:t>
+      </w:r>
+    </w:p>
+    <w:p>
+      <w:pPr>
+        <w:rPr>
+          <w:lang w:val="en-GB"/>
+        </w:rPr>
+      </w:pPr>
+    </w:p>
+    <w:p>
+      <w:pPr>
+        <w:rPr>
+          <w:lang w:val="en-GB"/>
+        </w:rPr>
+      </w:pPr>
+      <w:r>
+        <w:rPr>
+          <w:lang w:val="en-GB"/>
+        </w:rPr>
+        <w:t xml:space="preserve">  Sousa, E. B. D., Alexandre, B., Ferreira Mello, R., </w:t>
+      </w:r>
+      <w:proofErr w:type="spellStart"/>
+      <w:r>
+        <w:rPr>
+          <w:lang w:val="en-GB"/>
+        </w:rPr>
+        <w:t>Pontual</w:t>
+      </w:r>
+      <w:proofErr w:type="spellEnd"/>
+      <w:r>
+        <w:rPr>
+          <w:lang w:val="en-GB"/>
+        </w:rPr>
+        <w:t xml:space="preserve"> </w:t>
+      </w:r>
+      <w:proofErr w:type="spellStart"/>
+      <w:r>
+        <w:rPr>
+          <w:lang w:val="en-GB"/>
+        </w:rPr>
+        <w:t>FalcÃ£o</w:t>
+      </w:r>
+      <w:proofErr w:type="spellEnd"/>
+      <w:r>
+        <w:rPr>
+          <w:lang w:val="en-GB"/>
+        </w:rPr>
+        <w:t xml:space="preserve">, T., </w:t>
+      </w:r>
+      <w:proofErr w:type="spellStart"/>
+      <w:r>
+        <w:rPr>
+          <w:lang w:val="en-GB"/>
+        </w:rPr>
+        <w:t>Vesin</w:t>
+      </w:r>
+      <w:proofErr w:type="spellEnd"/>
+      <w:r>
+        <w:rPr>
+          <w:lang w:val="en-GB"/>
+        </w:rPr>
+        <w:t xml:space="preserve">, B., &amp; </w:t>
+      </w:r>
+      <w:proofErr w:type="spellStart"/>
+      <w:r>
+        <w:rPr>
+          <w:lang w:val="en-GB"/>
+        </w:rPr>
+        <w:t>GaÅ¡eviÄ</w:t>
+      </w:r>
+      <w:proofErr w:type="spellEnd"/>
+      <w:r>
+        <w:rPr>
+          <w:lang w:val="en-GB"/>
+        </w:rPr>
+        <w:t xml:space="preserve">‡, D. (2021). Applications of learning analytics in high schools: A systematic literature review. </w:t>
       </w:r>
       <w:r>
         <w:rPr>
@@ -8050,33 +9470,33 @@
           <w:iCs/>
           <w:lang w:val="en-GB"/>
         </w:rPr>
-        <w:t>International Educational Data Mining Society</w:t>
-      </w:r>
-      <w:r>
-        <w:rPr>
-          <w:lang w:val="en-GB"/>
-        </w:rPr>
-        <w:t>.</w:t>
-      </w:r>
-    </w:p>
-    <w:p>
-      <w:pPr>
-        <w:rPr>
-          <w:lang w:val="en-GB"/>
-        </w:rPr>
-      </w:pPr>
-    </w:p>
-    <w:p>
-      <w:pPr>
-        <w:rPr>
-          <w:lang w:val="en-GB"/>
-        </w:rPr>
-      </w:pPr>
-      <w:r>
-        <w:rPr>
-          <w:lang w:val="en-GB"/>
-        </w:rPr>
-        <w:t xml:space="preserve">  Tang, K. H. D. (2024). Implications of artificial intelligence for teaching and learning. </w:t>
+        <w:t>Frontiers in Artificial Intelligence</w:t>
+      </w:r>
+      <w:r>
+        <w:rPr>
+          <w:lang w:val="en-GB"/>
+        </w:rPr>
+        <w:t>, 4, 737891.</w:t>
+      </w:r>
+    </w:p>
+    <w:p>
+      <w:pPr>
+        <w:rPr>
+          <w:lang w:val="en-GB"/>
+        </w:rPr>
+      </w:pPr>
+    </w:p>
+    <w:p>
+      <w:pPr>
+        <w:rPr>
+          <w:lang w:val="en-GB"/>
+        </w:rPr>
+      </w:pPr>
+      <w:r>
+        <w:rPr>
+          <w:lang w:val="en-GB"/>
+        </w:rPr>
+        <w:t xml:space="preserve">  Stinar, F., Lee, H., Belitz, C., Nasiar, N., Fancsali, S. E., Ritter, S., ... &amp; Bosch, N. (2025). Fairness of Bayesian Knowledge Tracing for Math Learners of Different Reading Ability. </w:t>
       </w:r>
       <w:r>
         <w:rPr>
@@ -8084,34 +9504,33 @@
           <w:iCs/>
           <w:lang w:val="en-GB"/>
         </w:rPr>
-        <w:t>Acta Pedagogia Asiana</w:t>
-      </w:r>
-      <w:r>
-        <w:rPr>
-          <w:lang w:val="en-GB"/>
-        </w:rPr>
-        <w:t>, 3(2), 65-79.</w:t>
-      </w:r>
-    </w:p>
-    <w:p>
-      <w:pPr>
-        <w:rPr>
-          <w:lang w:val="en-GB"/>
-        </w:rPr>
-      </w:pPr>
-    </w:p>
-    <w:p>
-      <w:pPr>
-        <w:rPr>
-          <w:lang w:val="en-GB"/>
-        </w:rPr>
-      </w:pPr>
-      <w:r>
-        <w:rPr>
-          <w:lang w:val="en-GB"/>
-        </w:rPr>
-        <w:lastRenderedPageBreak/>
-        <w:t xml:space="preserve">  Viberg, O., Hatakka, M., Bälter, O., &amp; Mavroudi, A. (2018). The current landscape of learning analytics in higher education. </w:t>
+        <w:t>International Educational Data Mining Society</w:t>
+      </w:r>
+      <w:r>
+        <w:rPr>
+          <w:lang w:val="en-GB"/>
+        </w:rPr>
+        <w:t>.</w:t>
+      </w:r>
+    </w:p>
+    <w:p>
+      <w:pPr>
+        <w:rPr>
+          <w:lang w:val="en-GB"/>
+        </w:rPr>
+      </w:pPr>
+    </w:p>
+    <w:p>
+      <w:pPr>
+        <w:rPr>
+          <w:lang w:val="en-GB"/>
+        </w:rPr>
+      </w:pPr>
+      <w:r>
+        <w:rPr>
+          <w:lang w:val="en-GB"/>
+        </w:rPr>
+        <w:t xml:space="preserve">  Tang, K. H. D. (2024). Implications of artificial intelligence for teaching and learning. </w:t>
       </w:r>
       <w:r>
         <w:rPr>
@@ -8119,106 +9538,197 @@
           <w:iCs/>
           <w:lang w:val="en-GB"/>
         </w:rPr>
-        <w:t>Computers in Human Behavior</w:t>
-      </w:r>
-      <w:r>
-        <w:rPr>
-          <w:lang w:val="en-GB"/>
-        </w:rPr>
-        <w:t>, 89, 98-110.</w:t>
-      </w:r>
-    </w:p>
-    <w:p>
-      <w:pPr>
-        <w:rPr>
-          <w:lang w:val="en-GB"/>
-        </w:rPr>
-      </w:pPr>
-    </w:p>
-    <w:p>
-      <w:pPr>
-        <w:rPr>
-          <w:lang w:val="en-GB"/>
-        </w:rPr>
-      </w:pPr>
-      <w:r>
-        <w:rPr>
-          <w:lang w:val="en-GB"/>
-        </w:rPr>
-        <w:t xml:space="preserve">  Wu, X. Y., Ng, D. T. K., &amp; Chiu, T. K. (2026). Self-Regulated Learning with AI: A Comparative Analysis of General-Purpose and Task-Specific Platforms. </w:t>
-      </w:r>
+        <w:t xml:space="preserve">Acta </w:t>
+      </w:r>
+      <w:proofErr w:type="spellStart"/>
       <w:r>
         <w:rPr>
           <w:i/>
           <w:iCs/>
           <w:lang w:val="en-GB"/>
         </w:rPr>
-        <w:t>International Journal of Technology in Education</w:t>
-      </w:r>
-      <w:r>
-        <w:rPr>
-          <w:lang w:val="en-GB"/>
-        </w:rPr>
-        <w:t>, 9(1), 279-302.</w:t>
-      </w:r>
-    </w:p>
-    <w:p>
-      <w:pPr>
-        <w:rPr>
-          <w:lang w:val="en-GB"/>
-        </w:rPr>
-      </w:pPr>
-    </w:p>
-    <w:p>
-      <w:pPr>
-        <w:rPr>
-          <w:lang w:val="en-GB"/>
-        </w:rPr>
-      </w:pPr>
-      <w:r>
-        <w:rPr>
-          <w:lang w:val="en-GB"/>
-        </w:rPr>
-        <w:t xml:space="preserve">  Zimmerman, B. J., &amp; Schunk, D. H. (2011). Self-regulated learning and performance: An introduction and an overview. </w:t>
-      </w:r>
+        <w:t>Pedagogia</w:t>
+      </w:r>
+      <w:proofErr w:type="spellEnd"/>
       <w:r>
         <w:rPr>
           <w:i/>
           <w:iCs/>
           <w:lang w:val="en-GB"/>
         </w:rPr>
-        <w:t>Handbook of self-regulation of learning and performance</w:t>
-      </w:r>
-      <w:r>
-        <w:rPr>
-          <w:lang w:val="en-GB"/>
-        </w:rPr>
-        <w:t>, 15-26.</w:t>
-      </w:r>
-    </w:p>
-    <w:p>
-      <w:pPr>
-        <w:rPr>
-          <w:lang w:val="en-GB"/>
-        </w:rPr>
-      </w:pPr>
-    </w:p>
-    <w:p>
-      <w:pPr>
-        <w:jc w:val="both"/>
-      </w:pPr>
-      <w:r>
-        <w:t xml:space="preserve">Zimmerman, B. J. (2002). Becoming a self-regulated learner: An overview. </w:t>
+        <w:t xml:space="preserve"> Asiana</w:t>
+      </w:r>
+      <w:r>
+        <w:rPr>
+          <w:lang w:val="en-GB"/>
+        </w:rPr>
+        <w:t>, 3(2), 65-79.</w:t>
+      </w:r>
+    </w:p>
+    <w:p>
+      <w:pPr>
+        <w:rPr>
+          <w:lang w:val="en-GB"/>
+        </w:rPr>
+      </w:pPr>
+    </w:p>
+    <w:p>
+      <w:pPr>
+        <w:rPr>
+          <w:lang w:val="en-GB"/>
+        </w:rPr>
+      </w:pPr>
+      <w:r>
+        <w:rPr>
+          <w:lang w:val="en-GB"/>
+        </w:rPr>
+        <w:lastRenderedPageBreak/>
+        <w:t xml:space="preserve">  Viberg, O., </w:t>
+      </w:r>
+      <w:proofErr w:type="spellStart"/>
+      <w:r>
+        <w:rPr>
+          <w:lang w:val="en-GB"/>
+        </w:rPr>
+        <w:t>Hatakka</w:t>
+      </w:r>
+      <w:proofErr w:type="spellEnd"/>
+      <w:r>
+        <w:rPr>
+          <w:lang w:val="en-GB"/>
+        </w:rPr>
+        <w:t xml:space="preserve">, M., </w:t>
+      </w:r>
+      <w:proofErr w:type="spellStart"/>
+      <w:r>
+        <w:rPr>
+          <w:lang w:val="en-GB"/>
+        </w:rPr>
+        <w:t>BÃ¤lter</w:t>
+      </w:r>
+      <w:proofErr w:type="spellEnd"/>
+      <w:r>
+        <w:rPr>
+          <w:lang w:val="en-GB"/>
+        </w:rPr>
+        <w:t xml:space="preserve">, O., &amp; Mavroudi, A. (2018). The current landscape of learning analytics in higher education. </w:t>
       </w:r>
       <w:r>
         <w:rPr>
           <w:i/>
           <w:iCs/>
+          <w:lang w:val="en-GB"/>
+        </w:rPr>
+        <w:t xml:space="preserve">Computers in Human </w:t>
+      </w:r>
+      <w:proofErr w:type="spellStart"/>
+      <w:r>
+        <w:rPr>
+          <w:i/>
+          <w:iCs/>
+          <w:lang w:val="en-GB"/>
+        </w:rPr>
+        <w:t>Behavior</w:t>
+      </w:r>
+      <w:proofErr w:type="spellEnd"/>
+      <w:r>
+        <w:rPr>
+          <w:lang w:val="en-GB"/>
+        </w:rPr>
+        <w:t>, 89, 98-110.</w:t>
+      </w:r>
+    </w:p>
+    <w:p>
+      <w:pPr>
+        <w:rPr>
+          <w:lang w:val="en-GB"/>
+        </w:rPr>
+      </w:pPr>
+    </w:p>
+    <w:p>
+      <w:pPr>
+        <w:rPr>
+          <w:lang w:val="en-GB"/>
+        </w:rPr>
+      </w:pPr>
+      <w:r>
+        <w:rPr>
+          <w:lang w:val="en-GB"/>
+        </w:rPr>
+        <w:t xml:space="preserve">  Wu, X. Y., Ng, D. T. K., &amp; Chiu, T. K. (2026). Self-Regulated Learning with AI: A Comparative Analysis of General-Purpose and Task-Specific Platforms. </w:t>
+      </w:r>
+      <w:r>
+        <w:rPr>
+          <w:i/>
+          <w:iCs/>
+          <w:lang w:val="en-GB"/>
+        </w:rPr>
+        <w:t>International Journal of Technology in Education</w:t>
+      </w:r>
+      <w:r>
+        <w:rPr>
+          <w:lang w:val="en-GB"/>
+        </w:rPr>
+        <w:t>, 9(1), 279-302.</w:t>
+      </w:r>
+    </w:p>
+    <w:p>
+      <w:pPr>
+        <w:rPr>
+          <w:lang w:val="en-GB"/>
+        </w:rPr>
+      </w:pPr>
+    </w:p>
+    <w:p>
+      <w:pPr>
+        <w:rPr>
+          <w:lang w:val="en-GB"/>
+        </w:rPr>
+      </w:pPr>
+      <w:r>
+        <w:rPr>
+          <w:lang w:val="en-GB"/>
+        </w:rPr>
+        <w:t xml:space="preserve">  Zimmerman, B. J., &amp; Schunk, D. H. (2011). Self-regulated learning and performance: An introduction and an overview. </w:t>
+      </w:r>
+      <w:r>
+        <w:rPr>
+          <w:i/>
+          <w:iCs/>
+          <w:lang w:val="en-GB"/>
+        </w:rPr>
+        <w:t>Handbook of self-regulation of learning and performance</w:t>
+      </w:r>
+      <w:r>
+        <w:rPr>
+          <w:lang w:val="en-GB"/>
+        </w:rPr>
+        <w:t>, 15-26.</w:t>
+      </w:r>
+    </w:p>
+    <w:p>
+      <w:pPr>
+        <w:rPr>
+          <w:lang w:val="en-GB"/>
+        </w:rPr>
+      </w:pPr>
+    </w:p>
+    <w:p>
+      <w:pPr>
+        <w:jc w:val="both"/>
+      </w:pPr>
+      <w:r>
+        <w:t xml:space="preserve">Zimmerman, B. J. (2002). Becoming a self-regulated learner: An overview. </w:t>
+      </w:r>
+      <w:r>
+        <w:rPr>
+          <w:i/>
+          <w:iCs/>
         </w:rPr>
         <w:t>Theory Into Practice</w:t>
       </w:r>
       <w:r>
-        <w:t xml:space="preserve">, 41(2), 64–70. </w:t>
+        <w:t xml:space="preserve">, 41(2), 64â€“70. </w:t>
       </w:r>
     </w:p>
     <w:p/>
@@ -13418,6 +14928,8 @@
     <w:rsid w:val="00081145"/>
     <w:rsid w:val="00101378"/>
     <w:rsid w:val="001B6B0E"/>
+    <w:rsid w:val="00340F26"/>
+    <w:rsid w:val="00540A31"/>
     <w:rsid w:val="0057680F"/>
     <w:rsid w:val="00D61086"/>
     <w:rsid w:val="00EA2597"/>

</xml_diff>